<commit_message>
Atualiza currículo com portfólio completo V30
Expande o resumo profissional e projetos pessoais para cobrir toda a
suíte de SaaS (Genesis, Imóveis V30, Links, MeuNutriFit, Vitrine
Corporativo, ia-service) além do DiaBuddy, e adiciona competências em
Go, Flutter/Dart, Next.js, integrações de pagamento/IAP e a infra
self-hosted (Caddy, observabilidade).

Co-Authored-By: Claude Sonnet 5 <noreply@anthropic.com>
Claude-Session: https://claude.ai/code/session_01Bc8pNf8Rs261W76DZkmHy4
</commit_message>
<xml_diff>
--- a/Roberto Albino Junior.docx
+++ b/Roberto Albino Junior.docx
@@ -2,15 +2,14 @@
 <file path=word/document.xml><?xml version="1.0" encoding="utf-8"?>
 <w:document xmlns:w="http://schemas.openxmlformats.org/wordprocessingml/2006/main" xmlns:m="http://schemas.openxmlformats.org/officeDocument/2006/math" xmlns:r="http://schemas.openxmlformats.org/officeDocument/2006/relationships" xmlns:o="urn:schemas-microsoft-com:office:office" xmlns:v="urn:schemas-microsoft-com:vml" xmlns:w10="urn:schemas-microsoft-com:office:word" xmlns:a="http://schemas.openxmlformats.org/drawingml/2006/main" xmlns:pic="http://schemas.openxmlformats.org/drawingml/2006/picture" xmlns:wp="http://schemas.openxmlformats.org/drawingml/2006/wordprocessingDrawing">
   <w:body>
+    <w:bookmarkStart w:id="32" w:name="roberto-albino-junior"/>
     <w:p>
       <w:pPr>
         <w:pStyle w:val="Heading1"/>
       </w:pPr>
-      <w:bookmarkStart w:id="20" w:name="roberto-albino-junior"/>
       <w:r>
         <w:t xml:space="preserve">Roberto Albino Junior</w:t>
       </w:r>
-      <w:bookmarkEnd w:id="20"/>
     </w:p>
     <w:p>
       <w:pPr>
@@ -19,6 +18,7 @@
       <w:r>
         <w:rPr>
           <w:b/>
+          <w:bCs/>
         </w:rPr>
         <w:t xml:space="preserve">Senior Backend / Full-Stack Software Engineer</w:t>
       </w:r>
@@ -31,15 +31,16 @@
     </w:p>
     <w:p>
       <w:pPr>
+        <w:pStyle w:val="Compact"/>
         <w:numPr>
           <w:ilvl w:val="0"/>
           <w:numId w:val="1001"/>
         </w:numPr>
-        <w:pStyle w:val="Compact"/>
       </w:pPr>
       <w:r>
         <w:rPr>
           <w:b/>
+          <w:bCs/>
         </w:rPr>
         <w:t xml:space="preserve">Location:</w:t>
       </w:r>
@@ -52,15 +53,16 @@
     </w:p>
     <w:p>
       <w:pPr>
+        <w:pStyle w:val="Compact"/>
         <w:numPr>
           <w:ilvl w:val="0"/>
           <w:numId w:val="1001"/>
         </w:numPr>
-        <w:pStyle w:val="Compact"/>
       </w:pPr>
       <w:r>
         <w:rPr>
           <w:b/>
+          <w:bCs/>
         </w:rPr>
         <w:t xml:space="preserve">Phone:</w:t>
       </w:r>
@@ -73,22 +75,23 @@
     </w:p>
     <w:p>
       <w:pPr>
+        <w:pStyle w:val="Compact"/>
         <w:numPr>
           <w:ilvl w:val="0"/>
           <w:numId w:val="1001"/>
         </w:numPr>
-        <w:pStyle w:val="Compact"/>
       </w:pPr>
       <w:r>
         <w:rPr>
           <w:b/>
+          <w:bCs/>
         </w:rPr>
         <w:t xml:space="preserve">Email:</w:t>
       </w:r>
       <w:r>
         <w:t xml:space="preserve"> </w:t>
       </w:r>
-      <w:hyperlink r:id="rId21">
+      <w:hyperlink r:id="rId9">
         <w:r>
           <w:rPr>
             <w:rStyle w:val="Hyperlink"/>
@@ -99,22 +102,23 @@
     </w:p>
     <w:p>
       <w:pPr>
+        <w:pStyle w:val="Compact"/>
         <w:numPr>
           <w:ilvl w:val="0"/>
           <w:numId w:val="1001"/>
         </w:numPr>
-        <w:pStyle w:val="Compact"/>
       </w:pPr>
       <w:r>
         <w:rPr>
           <w:b/>
+          <w:bCs/>
         </w:rPr>
         <w:t xml:space="preserve">GitHub:</w:t>
       </w:r>
       <w:r>
         <w:t xml:space="preserve"> </w:t>
       </w:r>
-      <w:hyperlink r:id="rId22">
+      <w:hyperlink r:id="rId10">
         <w:r>
           <w:rPr>
             <w:rStyle w:val="Hyperlink"/>
@@ -125,22 +129,23 @@
     </w:p>
     <w:p>
       <w:pPr>
+        <w:pStyle w:val="Compact"/>
         <w:numPr>
           <w:ilvl w:val="0"/>
           <w:numId w:val="1001"/>
         </w:numPr>
-        <w:pStyle w:val="Compact"/>
       </w:pPr>
       <w:r>
         <w:rPr>
           <w:b/>
+          <w:bCs/>
         </w:rPr>
         <w:t xml:space="preserve">LinkedIn:</w:t>
       </w:r>
       <w:r>
         <w:t xml:space="preserve"> </w:t>
       </w:r>
-      <w:hyperlink r:id="rId23">
+      <w:hyperlink r:id="rId11">
         <w:r>
           <w:rPr>
             <w:rStyle w:val="Hyperlink"/>
@@ -149,15 +154,14 @@
         </w:r>
       </w:hyperlink>
     </w:p>
+    <w:bookmarkStart w:id="12" w:name="professional-summary"/>
     <w:p>
       <w:pPr>
         <w:pStyle w:val="Heading2"/>
       </w:pPr>
-      <w:bookmarkStart w:id="24" w:name="professional-summary"/>
       <w:r>
         <w:t xml:space="preserve">Professional Summary</w:t>
       </w:r>
-      <w:bookmarkEnd w:id="24"/>
     </w:p>
     <w:p>
       <w:pPr>
@@ -180,7 +184,33 @@
         <w:pStyle w:val="BodyText"/>
       </w:pPr>
       <w:r>
-        <w:t xml:space="preserve">Beyond professional experience, I architect and develop personal SaaS products in the health-tech space, including DiaBuddy, a diabetes management platform that integrates real-time glucose monitoring data, analytics, and predictive algorithms.</w:t>
+        <w:t xml:space="preserve">Beyond professional experience, I founded and operate</w:t>
+      </w:r>
+      <w:r>
+        <w:t xml:space="preserve"> </w:t>
+      </w:r>
+      <w:r>
+        <w:rPr>
+          <w:b/>
+          <w:bCs/>
+        </w:rPr>
+        <w:t xml:space="preserve">V30</w:t>
+      </w:r>
+      <w:r>
+        <w:t xml:space="preserve">, a self-hosted portfolio of independent SaaS products (health-tech, real estate, nutrition, faith and link-in-bio apps) that I design, build, and run end-to-end — Go and Java backends, Angular/Next.js frontends, Flutter mobile apps, and an internal AI-gateway service unifying OpenAI, Anthropic, and Gemini. Flagship product:</w:t>
+      </w:r>
+      <w:r>
+        <w:t xml:space="preserve"> </w:t>
+      </w:r>
+      <w:r>
+        <w:rPr>
+          <w:b/>
+          <w:bCs/>
+        </w:rPr>
+        <w:t xml:space="preserve">DiaBuddy</w:t>
+      </w:r>
+      <w:r>
+        <w:t xml:space="preserve">, a diabetes management platform that integrates real-time glucose monitoring data, analytics, and predictive algorithms.</w:t>
       </w:r>
     </w:p>
     <w:p>
@@ -188,7 +218,7 @@
         <w:pStyle w:val="BodyText"/>
       </w:pPr>
       <w:r>
-        <w:t xml:space="preserve">Today, I also manage a Linux VPS running containerized workloads across Go, Python, and Angular services, including the full observability setup that I designed and configured myself.</w:t>
+        <w:t xml:space="preserve">I administer the Linux VPS that hosts all of it myself — Docker Compose deployments behind a Caddy reverse proxy with automatic HTTPS, GitHub Actions CI/CD, multi-schema shared databases, and a self-configured observability stack (Prometheus, Loki, Promtail).</w:t>
       </w:r>
     </w:p>
     <w:p>
@@ -201,11 +231,11 @@
     </w:p>
     <w:p>
       <w:pPr>
+        <w:pStyle w:val="Compact"/>
         <w:numPr>
           <w:ilvl w:val="0"/>
           <w:numId w:val="1002"/>
         </w:numPr>
-        <w:pStyle w:val="Compact"/>
       </w:pPr>
       <w:r>
         <w:t xml:space="preserve">Performance</w:t>
@@ -213,11 +243,11 @@
     </w:p>
     <w:p>
       <w:pPr>
+        <w:pStyle w:val="Compact"/>
         <w:numPr>
           <w:ilvl w:val="0"/>
           <w:numId w:val="1002"/>
         </w:numPr>
-        <w:pStyle w:val="Compact"/>
       </w:pPr>
       <w:r>
         <w:t xml:space="preserve">Observability</w:t>
@@ -225,11 +255,11 @@
     </w:p>
     <w:p>
       <w:pPr>
+        <w:pStyle w:val="Compact"/>
         <w:numPr>
           <w:ilvl w:val="0"/>
           <w:numId w:val="1002"/>
         </w:numPr>
-        <w:pStyle w:val="Compact"/>
       </w:pPr>
       <w:r>
         <w:t xml:space="preserve">Clean architecture</w:t>
@@ -237,11 +267,11 @@
     </w:p>
     <w:p>
       <w:pPr>
+        <w:pStyle w:val="Compact"/>
         <w:numPr>
           <w:ilvl w:val="0"/>
           <w:numId w:val="1002"/>
         </w:numPr>
-        <w:pStyle w:val="Compact"/>
       </w:pPr>
       <w:r>
         <w:t xml:space="preserve">Testability</w:t>
@@ -249,11 +279,11 @@
     </w:p>
     <w:p>
       <w:pPr>
+        <w:pStyle w:val="Compact"/>
         <w:numPr>
           <w:ilvl w:val="0"/>
           <w:numId w:val="1002"/>
         </w:numPr>
-        <w:pStyle w:val="Compact"/>
       </w:pPr>
       <w:r>
         <w:t xml:space="preserve">Product thinking (not only coding)</w:t>
@@ -267,33 +297,32 @@
         <w:t xml:space="preserve">I actively design systems considering scalability, resilience, and maintainability.</w:t>
       </w:r>
     </w:p>
+    <w:bookmarkEnd w:id="12"/>
+    <w:bookmarkStart w:id="18" w:name="core-competencies"/>
     <w:p>
       <w:pPr>
         <w:pStyle w:val="Heading2"/>
       </w:pPr>
-      <w:bookmarkStart w:id="25" w:name="core-competencies"/>
       <w:r>
         <w:t xml:space="preserve">Core Competencies</w:t>
       </w:r>
-      <w:bookmarkEnd w:id="25"/>
-    </w:p>
+    </w:p>
+    <w:bookmarkStart w:id="13" w:name="backend-architecture"/>
     <w:p>
       <w:pPr>
         <w:pStyle w:val="Heading3"/>
       </w:pPr>
-      <w:bookmarkStart w:id="26" w:name="backend-architecture"/>
       <w:r>
         <w:t xml:space="preserve">Backend &amp; Architecture</w:t>
       </w:r>
-      <w:bookmarkEnd w:id="26"/>
-    </w:p>
-    <w:p>
-      <w:pPr>
+    </w:p>
+    <w:p>
+      <w:pPr>
+        <w:pStyle w:val="Compact"/>
         <w:numPr>
           <w:ilvl w:val="0"/>
           <w:numId w:val="1003"/>
         </w:numPr>
-        <w:pStyle w:val="Compact"/>
       </w:pPr>
       <w:r>
         <w:t xml:space="preserve">Java 17/21, Spring Boot, Spring Data, Spring Security</w:t>
@@ -301,11 +330,23 @@
     </w:p>
     <w:p>
       <w:pPr>
+        <w:pStyle w:val="Compact"/>
         <w:numPr>
           <w:ilvl w:val="0"/>
           <w:numId w:val="1003"/>
         </w:numPr>
-        <w:pStyle w:val="Compact"/>
+      </w:pPr>
+      <w:r>
+        <w:t xml:space="preserve">Go (Gin, GORM) — production microservices and REST APIs</w:t>
+      </w:r>
+    </w:p>
+    <w:p>
+      <w:pPr>
+        <w:pStyle w:val="Compact"/>
+        <w:numPr>
+          <w:ilvl w:val="0"/>
+          <w:numId w:val="1003"/>
+        </w:numPr>
       </w:pPr>
       <w:r>
         <w:t xml:space="preserve">REST APIs, BFF pattern</w:t>
@@ -313,23 +354,35 @@
     </w:p>
     <w:p>
       <w:pPr>
+        <w:pStyle w:val="Compact"/>
         <w:numPr>
           <w:ilvl w:val="0"/>
           <w:numId w:val="1003"/>
         </w:numPr>
-        <w:pStyle w:val="Compact"/>
-      </w:pPr>
-      <w:r>
-        <w:t xml:space="preserve">LLM/API integrations: ChatGPT (OpenAI), Anthropic (Claude), and Google Gemini</w:t>
-      </w:r>
-    </w:p>
-    <w:p>
-      <w:pPr>
+      </w:pPr>
+      <w:r>
+        <w:t xml:space="preserve">LLM/API integrations: ChatGPT (OpenAI), Anthropic (Claude), and Google Gemini (built an internal Go gateway service unifying all three)</w:t>
+      </w:r>
+    </w:p>
+    <w:p>
+      <w:pPr>
+        <w:pStyle w:val="Compact"/>
         <w:numPr>
           <w:ilvl w:val="0"/>
           <w:numId w:val="1003"/>
         </w:numPr>
-        <w:pStyle w:val="Compact"/>
+      </w:pPr>
+      <w:r>
+        <w:t xml:space="preserve">Payment &amp; subscription integrations: Mercado Pago checkout/webhooks, Apple App Store and Google Play in-app purchase verification</w:t>
+      </w:r>
+    </w:p>
+    <w:p>
+      <w:pPr>
+        <w:pStyle w:val="Compact"/>
+        <w:numPr>
+          <w:ilvl w:val="0"/>
+          <w:numId w:val="1003"/>
+        </w:numPr>
       </w:pPr>
       <w:r>
         <w:t xml:space="preserve">Microservices and modular monoliths</w:t>
@@ -337,11 +390,11 @@
     </w:p>
     <w:p>
       <w:pPr>
+        <w:pStyle w:val="Compact"/>
         <w:numPr>
           <w:ilvl w:val="0"/>
           <w:numId w:val="1003"/>
         </w:numPr>
-        <w:pStyle w:val="Compact"/>
       </w:pPr>
       <w:r>
         <w:t xml:space="preserve">Event-driven architecture</w:t>
@@ -349,11 +402,11 @@
     </w:p>
     <w:p>
       <w:pPr>
+        <w:pStyle w:val="Compact"/>
         <w:numPr>
           <w:ilvl w:val="0"/>
           <w:numId w:val="1003"/>
         </w:numPr>
-        <w:pStyle w:val="Compact"/>
       </w:pPr>
       <w:r>
         <w:t xml:space="preserve">Transaction management (</w:t>
@@ -370,11 +423,11 @@
     </w:p>
     <w:p>
       <w:pPr>
+        <w:pStyle w:val="Compact"/>
         <w:numPr>
           <w:ilvl w:val="0"/>
           <w:numId w:val="1003"/>
         </w:numPr>
-        <w:pStyle w:val="Compact"/>
       </w:pPr>
       <w:r>
         <w:t xml:space="preserve">Domain-Driven Design (DDD)</w:t>
@@ -382,11 +435,11 @@
     </w:p>
     <w:p>
       <w:pPr>
+        <w:pStyle w:val="Compact"/>
         <w:numPr>
           <w:ilvl w:val="0"/>
           <w:numId w:val="1003"/>
         </w:numPr>
-        <w:pStyle w:val="Compact"/>
       </w:pPr>
       <w:r>
         <w:t xml:space="preserve">Integration systems and data processing pipelines</w:t>
@@ -394,33 +447,33 @@
     </w:p>
     <w:p>
       <w:pPr>
+        <w:pStyle w:val="Compact"/>
         <w:numPr>
           <w:ilvl w:val="0"/>
           <w:numId w:val="1003"/>
         </w:numPr>
-        <w:pStyle w:val="Compact"/>
       </w:pPr>
       <w:r>
         <w:t xml:space="preserve">Batch processing and asynchronous workflows</w:t>
       </w:r>
     </w:p>
+    <w:bookmarkEnd w:id="13"/>
+    <w:bookmarkStart w:id="14" w:name="cloud-devops"/>
     <w:p>
       <w:pPr>
         <w:pStyle w:val="Heading3"/>
       </w:pPr>
-      <w:bookmarkStart w:id="27" w:name="cloud-devops"/>
       <w:r>
         <w:t xml:space="preserve">Cloud &amp; DevOps</w:t>
       </w:r>
-      <w:bookmarkEnd w:id="27"/>
-    </w:p>
-    <w:p>
-      <w:pPr>
+    </w:p>
+    <w:p>
+      <w:pPr>
+        <w:pStyle w:val="Compact"/>
         <w:numPr>
           <w:ilvl w:val="0"/>
           <w:numId w:val="1004"/>
         </w:numPr>
-        <w:pStyle w:val="Compact"/>
       </w:pPr>
       <w:r>
         <w:t xml:space="preserve">AWS (S3, SQS, Lambda, Step Functions, EC2, EKS)</w:t>
@@ -428,11 +481,11 @@
     </w:p>
     <w:p>
       <w:pPr>
+        <w:pStyle w:val="Compact"/>
         <w:numPr>
           <w:ilvl w:val="0"/>
           <w:numId w:val="1004"/>
         </w:numPr>
-        <w:pStyle w:val="Compact"/>
       </w:pPr>
       <w:r>
         <w:t xml:space="preserve">Docker and Kubernetes (EKS)</w:t>
@@ -440,23 +493,47 @@
     </w:p>
     <w:p>
       <w:pPr>
+        <w:pStyle w:val="Compact"/>
         <w:numPr>
           <w:ilvl w:val="0"/>
           <w:numId w:val="1004"/>
         </w:numPr>
-        <w:pStyle w:val="Compact"/>
-      </w:pPr>
-      <w:r>
-        <w:t xml:space="preserve">Linux VPS administration for containerized services (Go, Python, Angular), including self-configured end-to-end observability</w:t>
-      </w:r>
-    </w:p>
-    <w:p>
-      <w:pPr>
+      </w:pPr>
+      <w:r>
+        <w:t xml:space="preserve">Linux VPS administration for a multi-service containerized platform (Go, Java, Python, Angular, Next.js), including self-configured end-to-end observability</w:t>
+      </w:r>
+    </w:p>
+    <w:p>
+      <w:pPr>
+        <w:pStyle w:val="Compact"/>
         <w:numPr>
           <w:ilvl w:val="0"/>
           <w:numId w:val="1004"/>
         </w:numPr>
-        <w:pStyle w:val="Compact"/>
+      </w:pPr>
+      <w:r>
+        <w:t xml:space="preserve">Caddy reverse proxy with automatic TLS (Let’s Encrypt); GitHub Actions deploy pipelines</w:t>
+      </w:r>
+    </w:p>
+    <w:p>
+      <w:pPr>
+        <w:pStyle w:val="Compact"/>
+        <w:numPr>
+          <w:ilvl w:val="0"/>
+          <w:numId w:val="1004"/>
+        </w:numPr>
+      </w:pPr>
+      <w:r>
+        <w:t xml:space="preserve">S3-compatible object storage (AWS S3, DigitalOcean Spaces) and Azure Blob Storage</w:t>
+      </w:r>
+    </w:p>
+    <w:p>
+      <w:pPr>
+        <w:pStyle w:val="Compact"/>
+        <w:numPr>
+          <w:ilvl w:val="0"/>
+          <w:numId w:val="1004"/>
+        </w:numPr>
       </w:pPr>
       <w:r>
         <w:t xml:space="preserve">CI/CD (GitLab CI, GitHub Actions)</w:t>
@@ -464,11 +541,11 @@
     </w:p>
     <w:p>
       <w:pPr>
+        <w:pStyle w:val="Compact"/>
         <w:numPr>
           <w:ilvl w:val="0"/>
           <w:numId w:val="1004"/>
         </w:numPr>
-        <w:pStyle w:val="Compact"/>
       </w:pPr>
       <w:r>
         <w:t xml:space="preserve">Infrastructure troubleshooting in production</w:t>
@@ -476,57 +553,57 @@
     </w:p>
     <w:p>
       <w:pPr>
+        <w:pStyle w:val="Compact"/>
         <w:numPr>
           <w:ilvl w:val="0"/>
           <w:numId w:val="1004"/>
         </w:numPr>
-        <w:pStyle w:val="Compact"/>
-      </w:pPr>
-      <w:r>
-        <w:t xml:space="preserve">Observability and logging (Splunk, centralized logs)</w:t>
-      </w:r>
-    </w:p>
-    <w:p>
-      <w:pPr>
+      </w:pPr>
+      <w:r>
+        <w:t xml:space="preserve">Observability and logging (Splunk, centralized logs, self-hosted Prometheus/Loki/Promtail stack)</w:t>
+      </w:r>
+    </w:p>
+    <w:p>
+      <w:pPr>
+        <w:pStyle w:val="Compact"/>
         <w:numPr>
           <w:ilvl w:val="0"/>
           <w:numId w:val="1004"/>
         </w:numPr>
-        <w:pStyle w:val="Compact"/>
       </w:pPr>
       <w:r>
         <w:t xml:space="preserve">LocalStack, TestContainers</w:t>
       </w:r>
     </w:p>
+    <w:bookmarkEnd w:id="14"/>
+    <w:bookmarkStart w:id="15" w:name="databases-data"/>
     <w:p>
       <w:pPr>
         <w:pStyle w:val="Heading3"/>
       </w:pPr>
-      <w:bookmarkStart w:id="28" w:name="databases-data"/>
       <w:r>
         <w:t xml:space="preserve">Databases &amp; Data</w:t>
       </w:r>
-      <w:bookmarkEnd w:id="28"/>
-    </w:p>
-    <w:p>
-      <w:pPr>
+    </w:p>
+    <w:p>
+      <w:pPr>
+        <w:pStyle w:val="Compact"/>
         <w:numPr>
           <w:ilvl w:val="0"/>
           <w:numId w:val="1005"/>
         </w:numPr>
-        <w:pStyle w:val="Compact"/>
-      </w:pPr>
-      <w:r>
-        <w:t xml:space="preserve">PostgreSQL</w:t>
-      </w:r>
-    </w:p>
-    <w:p>
-      <w:pPr>
+      </w:pPr>
+      <w:r>
+        <w:t xml:space="preserve">PostgreSQL, MySQL</w:t>
+      </w:r>
+    </w:p>
+    <w:p>
+      <w:pPr>
+        <w:pStyle w:val="Compact"/>
         <w:numPr>
           <w:ilvl w:val="0"/>
           <w:numId w:val="1005"/>
         </w:numPr>
-        <w:pStyle w:val="Compact"/>
       </w:pPr>
       <w:r>
         <w:t xml:space="preserve">SQL performance tuning</w:t>
@@ -534,57 +611,57 @@
     </w:p>
     <w:p>
       <w:pPr>
+        <w:pStyle w:val="Compact"/>
         <w:numPr>
           <w:ilvl w:val="0"/>
           <w:numId w:val="1005"/>
         </w:numPr>
-        <w:pStyle w:val="Compact"/>
-      </w:pPr>
-      <w:r>
-        <w:t xml:space="preserve">Liquibase migrations</w:t>
-      </w:r>
-    </w:p>
-    <w:p>
-      <w:pPr>
+      </w:pPr>
+      <w:r>
+        <w:t xml:space="preserve">Liquibase and Flyway migrations</w:t>
+      </w:r>
+    </w:p>
+    <w:p>
+      <w:pPr>
+        <w:pStyle w:val="Compact"/>
         <w:numPr>
           <w:ilvl w:val="0"/>
           <w:numId w:val="1005"/>
         </w:numPr>
-        <w:pStyle w:val="Compact"/>
-      </w:pPr>
-      <w:r>
-        <w:t xml:space="preserve">Multi-schema database strategies</w:t>
-      </w:r>
-    </w:p>
-    <w:p>
-      <w:pPr>
+      </w:pPr>
+      <w:r>
+        <w:t xml:space="preserve">Multi-schema database strategies (single RDS cluster shared across multiple products, isolated per schema)</w:t>
+      </w:r>
+    </w:p>
+    <w:p>
+      <w:pPr>
+        <w:pStyle w:val="Compact"/>
         <w:numPr>
           <w:ilvl w:val="0"/>
           <w:numId w:val="1005"/>
         </w:numPr>
-        <w:pStyle w:val="Compact"/>
       </w:pPr>
       <w:r>
         <w:t xml:space="preserve">Data ingestion pipelines</w:t>
       </w:r>
     </w:p>
+    <w:bookmarkEnd w:id="15"/>
+    <w:bookmarkStart w:id="16" w:name="frontend-other-languages"/>
     <w:p>
       <w:pPr>
         <w:pStyle w:val="Heading3"/>
       </w:pPr>
-      <w:bookmarkStart w:id="29" w:name="frontend-other-languages"/>
       <w:r>
         <w:t xml:space="preserve">Frontend &amp; Other Languages</w:t>
       </w:r>
-      <w:bookmarkEnd w:id="29"/>
-    </w:p>
-    <w:p>
-      <w:pPr>
+    </w:p>
+    <w:p>
+      <w:pPr>
+        <w:pStyle w:val="Compact"/>
         <w:numPr>
           <w:ilvl w:val="0"/>
           <w:numId w:val="1006"/>
         </w:numPr>
-        <w:pStyle w:val="Compact"/>
       </w:pPr>
       <w:r>
         <w:t xml:space="preserve">TypeScript / JavaScript</w:t>
@@ -592,23 +669,35 @@
     </w:p>
     <w:p>
       <w:pPr>
+        <w:pStyle w:val="Compact"/>
         <w:numPr>
           <w:ilvl w:val="0"/>
           <w:numId w:val="1006"/>
         </w:numPr>
-        <w:pStyle w:val="Compact"/>
-      </w:pPr>
-      <w:r>
-        <w:t xml:space="preserve">Angular</w:t>
-      </w:r>
-    </w:p>
-    <w:p>
-      <w:pPr>
+      </w:pPr>
+      <w:r>
+        <w:t xml:space="preserve">Angular (incl. Angular 22 standalone), Next.js / React</w:t>
+      </w:r>
+    </w:p>
+    <w:p>
+      <w:pPr>
+        <w:pStyle w:val="Compact"/>
         <w:numPr>
           <w:ilvl w:val="0"/>
           <w:numId w:val="1006"/>
         </w:numPr>
-        <w:pStyle w:val="Compact"/>
+      </w:pPr>
+      <w:r>
+        <w:t xml:space="preserve">Flutter / Dart — shipped multiple iOS &amp; Android apps</w:t>
+      </w:r>
+    </w:p>
+    <w:p>
+      <w:pPr>
+        <w:pStyle w:val="Compact"/>
+        <w:numPr>
+          <w:ilvl w:val="0"/>
+          <w:numId w:val="1006"/>
+        </w:numPr>
       </w:pPr>
       <w:r>
         <w:t xml:space="preserve">Python (FastAPI, automation, lambdas)</w:t>
@@ -616,33 +705,33 @@
     </w:p>
     <w:p>
       <w:pPr>
+        <w:pStyle w:val="Compact"/>
         <w:numPr>
           <w:ilvl w:val="0"/>
           <w:numId w:val="1006"/>
         </w:numPr>
-        <w:pStyle w:val="Compact"/>
       </w:pPr>
       <w:r>
         <w:t xml:space="preserve">C#</w:t>
       </w:r>
     </w:p>
+    <w:bookmarkEnd w:id="16"/>
+    <w:bookmarkStart w:id="17" w:name="testing-quality"/>
     <w:p>
       <w:pPr>
         <w:pStyle w:val="Heading3"/>
       </w:pPr>
-      <w:bookmarkStart w:id="30" w:name="testing-quality"/>
       <w:r>
         <w:t xml:space="preserve">Testing &amp; Quality</w:t>
       </w:r>
-      <w:bookmarkEnd w:id="30"/>
-    </w:p>
-    <w:p>
-      <w:pPr>
+    </w:p>
+    <w:p>
+      <w:pPr>
+        <w:pStyle w:val="Compact"/>
         <w:numPr>
           <w:ilvl w:val="0"/>
           <w:numId w:val="1007"/>
         </w:numPr>
-        <w:pStyle w:val="Compact"/>
       </w:pPr>
       <w:r>
         <w:t xml:space="preserve">Unit tests (JUnit)</w:t>
@@ -650,11 +739,11 @@
     </w:p>
     <w:p>
       <w:pPr>
+        <w:pStyle w:val="Compact"/>
         <w:numPr>
           <w:ilvl w:val="0"/>
           <w:numId w:val="1007"/>
         </w:numPr>
-        <w:pStyle w:val="Compact"/>
       </w:pPr>
       <w:r>
         <w:t xml:space="preserve">Frontend testing (Karma, Jasmine)</w:t>
@@ -662,11 +751,11 @@
     </w:p>
     <w:p>
       <w:pPr>
+        <w:pStyle w:val="Compact"/>
         <w:numPr>
           <w:ilvl w:val="0"/>
           <w:numId w:val="1007"/>
         </w:numPr>
-        <w:pStyle w:val="Compact"/>
       </w:pPr>
       <w:r>
         <w:t xml:space="preserve">Integration testing</w:t>
@@ -674,11 +763,11 @@
     </w:p>
     <w:p>
       <w:pPr>
+        <w:pStyle w:val="Compact"/>
         <w:numPr>
           <w:ilvl w:val="0"/>
           <w:numId w:val="1007"/>
         </w:numPr>
-        <w:pStyle w:val="Compact"/>
       </w:pPr>
       <w:r>
         <w:t xml:space="preserve">Test coverage culture</w:t>
@@ -686,35 +775,35 @@
     </w:p>
     <w:p>
       <w:pPr>
+        <w:pStyle w:val="Compact"/>
         <w:numPr>
           <w:ilvl w:val="0"/>
           <w:numId w:val="1007"/>
         </w:numPr>
-        <w:pStyle w:val="Compact"/>
       </w:pPr>
       <w:r>
         <w:t xml:space="preserve">CI quality gates</w:t>
       </w:r>
     </w:p>
+    <w:bookmarkEnd w:id="17"/>
+    <w:bookmarkEnd w:id="18"/>
+    <w:bookmarkStart w:id="20" w:name="personal-projects-selected"/>
     <w:p>
       <w:pPr>
         <w:pStyle w:val="Heading2"/>
       </w:pPr>
-      <w:bookmarkStart w:id="31" w:name="personal-projects-selected"/>
       <w:r>
         <w:t xml:space="preserve">Personal Projects (Selected)</w:t>
       </w:r>
-      <w:bookmarkEnd w:id="31"/>
-    </w:p>
+    </w:p>
+    <w:bookmarkStart w:id="19" w:name="v30---self-hosted-saas-product-suite"/>
     <w:p>
       <w:pPr>
         <w:pStyle w:val="Heading3"/>
       </w:pPr>
-      <w:bookmarkStart w:id="32" w:name="diabuddy---diabetes-management-platform"/>
-      <w:r>
-        <w:t xml:space="preserve">DiaBuddy - Diabetes Management Platform</w:t>
-      </w:r>
-      <w:bookmarkEnd w:id="32"/>
+      <w:r>
+        <w:t xml:space="preserve">V30 - Self-Hosted SaaS Product Suite</w:t>
+      </w:r>
     </w:p>
     <w:p>
       <w:pPr>
@@ -723,6 +812,7 @@
       <w:r>
         <w:rPr>
           <w:b/>
+          <w:bCs/>
         </w:rPr>
         <w:t xml:space="preserve">Founder &amp; Software Architect</w:t>
       </w:r>
@@ -732,192 +822,279 @@
         <w:pStyle w:val="BodyText"/>
       </w:pPr>
       <w:r>
-        <w:t xml:space="preserve">A health-tech SaaS platform designed to help people with diabetes manage their daily treatment.</w:t>
+        <w:t xml:space="preserve">I design, build, and operate a portfolio of independent SaaS products end-to-end — backend, frontend, and mobile — all self-hosted on a Linux VPS I administer myself, behind a shared Caddy reverse proxy with automatic HTTPS and a centralized Prometheus/Loki/Promtail observability stack.</w:t>
       </w:r>
     </w:p>
     <w:p>
       <w:pPr>
         <w:pStyle w:val="BodyText"/>
-      </w:pPr>
-      <w:r>
-        <w:t xml:space="preserve">Key features:</w:t>
-      </w:r>
-    </w:p>
-    <w:p>
-      <w:pPr>
-        <w:numPr>
-          <w:ilvl w:val="0"/>
-          <w:numId w:val="1008"/>
-        </w:numPr>
-        <w:pStyle w:val="Compact"/>
-      </w:pPr>
-      <w:r>
-        <w:t xml:space="preserve">Continuous Glucose Monitoring (CGM) integrations (Nightscout ecosystem)</w:t>
-      </w:r>
-    </w:p>
-    <w:p>
-      <w:pPr>
-        <w:numPr>
-          <w:ilvl w:val="0"/>
-          <w:numId w:val="1008"/>
-        </w:numPr>
-        <w:pStyle w:val="Compact"/>
-      </w:pPr>
-      <w:r>
-        <w:t xml:space="preserve">Carbohydrate counting using AI image analysis</w:t>
-      </w:r>
-    </w:p>
-    <w:p>
-      <w:pPr>
-        <w:numPr>
-          <w:ilvl w:val="0"/>
-          <w:numId w:val="1008"/>
-        </w:numPr>
-        <w:pStyle w:val="Compact"/>
-      </w:pPr>
-      <w:r>
-        <w:t xml:space="preserve">Insulin dose assistance calculations (ICR, ISF/ICF, IOB/COB)</w:t>
-      </w:r>
-    </w:p>
-    <w:p>
-      <w:pPr>
-        <w:numPr>
-          <w:ilvl w:val="0"/>
-          <w:numId w:val="1008"/>
-        </w:numPr>
-        <w:pStyle w:val="Compact"/>
-      </w:pPr>
-      <w:r>
-        <w:t xml:space="preserve">Predictive glucose analytics</w:t>
-      </w:r>
-    </w:p>
-    <w:p>
-      <w:pPr>
-        <w:numPr>
-          <w:ilvl w:val="0"/>
-          <w:numId w:val="1008"/>
-        </w:numPr>
-        <w:pStyle w:val="Compact"/>
-      </w:pPr>
-      <w:r>
-        <w:t xml:space="preserve">Mobile-friendly PWA and Android collector app</w:t>
-      </w:r>
-    </w:p>
-    <w:p>
-      <w:pPr>
-        <w:numPr>
-          <w:ilvl w:val="0"/>
-          <w:numId w:val="1008"/>
-        </w:numPr>
-        <w:pStyle w:val="Compact"/>
-      </w:pPr>
-      <w:r>
-        <w:t xml:space="preserve">Cloud backend with analytics and data storage</w:t>
-      </w:r>
-    </w:p>
-    <w:p>
-      <w:pPr>
-        <w:pStyle w:val="FirstParagraph"/>
-      </w:pPr>
-      <w:r>
-        <w:t xml:space="preserve">Technical highlights:</w:t>
-      </w:r>
-    </w:p>
-    <w:p>
-      <w:pPr>
-        <w:numPr>
-          <w:ilvl w:val="0"/>
-          <w:numId w:val="1009"/>
-        </w:numPr>
-        <w:pStyle w:val="Compact"/>
-      </w:pPr>
-      <w:r>
-        <w:t xml:space="preserve">Angular frontend + FastAPI backend</w:t>
-      </w:r>
-    </w:p>
-    <w:p>
-      <w:pPr>
-        <w:numPr>
-          <w:ilvl w:val="0"/>
-          <w:numId w:val="1009"/>
-        </w:numPr>
-        <w:pStyle w:val="Compact"/>
-      </w:pPr>
-      <w:r>
-        <w:t xml:space="preserve">PostgreSQL database</w:t>
-      </w:r>
-    </w:p>
-    <w:p>
-      <w:pPr>
-        <w:numPr>
-          <w:ilvl w:val="0"/>
-          <w:numId w:val="1009"/>
-        </w:numPr>
-        <w:pStyle w:val="Compact"/>
-      </w:pPr>
-      <w:r>
-        <w:t xml:space="preserve">AI-assisted food recognition</w:t>
-      </w:r>
-    </w:p>
-    <w:p>
-      <w:pPr>
-        <w:numPr>
-          <w:ilvl w:val="0"/>
-          <w:numId w:val="1009"/>
-        </w:numPr>
-        <w:pStyle w:val="Compact"/>
-      </w:pPr>
-      <w:r>
-        <w:t xml:space="preserve">Health data processing pipelines</w:t>
-      </w:r>
-    </w:p>
-    <w:p>
-      <w:pPr>
-        <w:numPr>
-          <w:ilvl w:val="0"/>
-          <w:numId w:val="1009"/>
-        </w:numPr>
-        <w:pStyle w:val="Compact"/>
-      </w:pPr>
-      <w:r>
-        <w:t xml:space="preserve">Real-time data ingestion</w:t>
-      </w:r>
-    </w:p>
-    <w:p>
-      <w:pPr>
-        <w:pStyle w:val="FirstParagraph"/>
-      </w:pPr>
-      <w:r>
-        <w:t xml:space="preserve">This project demonstrates product ownership, architecture design, and end-to-end system development beyond enterprise environments.</w:t>
-      </w:r>
-    </w:p>
-    <w:p>
-      <w:pPr>
-        <w:pStyle w:val="Heading2"/>
-      </w:pPr>
-      <w:bookmarkStart w:id="33" w:name="professional-experience"/>
-      <w:r>
-        <w:t xml:space="preserve">Professional Experience</w:t>
-      </w:r>
-      <w:bookmarkEnd w:id="33"/>
-    </w:p>
-    <w:p>
-      <w:pPr>
-        <w:pStyle w:val="Heading3"/>
-      </w:pPr>
-      <w:bookmarkStart w:id="34" w:name="orla.tech---anbima"/>
-      <w:r>
-        <w:t xml:space="preserve">Orla.tech - ANBIMA</w:t>
-      </w:r>
-      <w:bookmarkEnd w:id="34"/>
-    </w:p>
-    <w:p>
-      <w:pPr>
-        <w:pStyle w:val="FirstParagraph"/>
       </w:pPr>
       <w:r>
         <w:rPr>
           <w:b/>
+          <w:bCs/>
+        </w:rPr>
+        <w:t xml:space="preserve">DiaBuddy — Diabetes Management Platform</w:t>
+      </w:r>
+      <w:r>
+        <w:t xml:space="preserve"> </w:t>
+      </w:r>
+      <w:r>
+        <w:t xml:space="preserve">(flagship product)</w:t>
+      </w:r>
+    </w:p>
+    <w:p>
+      <w:pPr>
+        <w:pStyle w:val="BodyText"/>
+      </w:pPr>
+      <w:r>
+        <w:t xml:space="preserve">A health-tech platform to help people with diabetes manage their daily treatment.</w:t>
+      </w:r>
+    </w:p>
+    <w:p>
+      <w:pPr>
+        <w:pStyle w:val="Compact"/>
+        <w:numPr>
+          <w:ilvl w:val="0"/>
+          <w:numId w:val="1008"/>
+        </w:numPr>
+      </w:pPr>
+      <w:r>
+        <w:t xml:space="preserve">Continuous Glucose Monitoring (CGM) integrations (Nightscout ecosystem)</w:t>
+      </w:r>
+    </w:p>
+    <w:p>
+      <w:pPr>
+        <w:pStyle w:val="Compact"/>
+        <w:numPr>
+          <w:ilvl w:val="0"/>
+          <w:numId w:val="1008"/>
+        </w:numPr>
+      </w:pPr>
+      <w:r>
+        <w:t xml:space="preserve">Carbohydrate counting using AI image analysis</w:t>
+      </w:r>
+    </w:p>
+    <w:p>
+      <w:pPr>
+        <w:pStyle w:val="Compact"/>
+        <w:numPr>
+          <w:ilvl w:val="0"/>
+          <w:numId w:val="1008"/>
+        </w:numPr>
+      </w:pPr>
+      <w:r>
+        <w:t xml:space="preserve">Insulin dose assistance calculations (ICR, ISF/ICF, IOB/COB)</w:t>
+      </w:r>
+    </w:p>
+    <w:p>
+      <w:pPr>
+        <w:pStyle w:val="Compact"/>
+        <w:numPr>
+          <w:ilvl w:val="0"/>
+          <w:numId w:val="1008"/>
+        </w:numPr>
+      </w:pPr>
+      <w:r>
+        <w:t xml:space="preserve">Predictive glucose analytics</w:t>
+      </w:r>
+    </w:p>
+    <w:p>
+      <w:pPr>
+        <w:pStyle w:val="Compact"/>
+        <w:numPr>
+          <w:ilvl w:val="0"/>
+          <w:numId w:val="1008"/>
+        </w:numPr>
+      </w:pPr>
+      <w:r>
+        <w:t xml:space="preserve">Flutter mobile app + FastAPI backend + PostgreSQL, real-time data ingestion pipelines</w:t>
+      </w:r>
+    </w:p>
+    <w:p>
+      <w:pPr>
+        <w:pStyle w:val="FirstParagraph"/>
+      </w:pPr>
+      <w:r>
+        <w:t xml:space="preserve">Other products in the suite:</w:t>
+      </w:r>
+    </w:p>
+    <w:p>
+      <w:pPr>
+        <w:pStyle w:val="Compact"/>
+        <w:numPr>
+          <w:ilvl w:val="0"/>
+          <w:numId w:val="1009"/>
+        </w:numPr>
+      </w:pPr>
+      <w:r>
+        <w:rPr>
+          <w:b/>
+          <w:bCs/>
+        </w:rPr>
+        <w:t xml:space="preserve">Genesis</w:t>
+      </w:r>
+      <w:r>
+        <w:t xml:space="preserve"> </w:t>
+      </w:r>
+      <w:r>
+        <w:t xml:space="preserve">— subscription-based Bible/devotional app (Flutter, Go/Gin backend); Google Sign-In auth; Apple App Store and Google Play in-app purchase verification</w:t>
+      </w:r>
+    </w:p>
+    <w:p>
+      <w:pPr>
+        <w:pStyle w:val="Compact"/>
+        <w:numPr>
+          <w:ilvl w:val="0"/>
+          <w:numId w:val="1009"/>
+        </w:numPr>
+      </w:pPr>
+      <w:r>
+        <w:rPr>
+          <w:b/>
+          <w:bCs/>
+        </w:rPr>
+        <w:t xml:space="preserve">Imóveis V30</w:t>
+      </w:r>
+      <w:r>
+        <w:t xml:space="preserve"> </w:t>
+      </w:r>
+      <w:r>
+        <w:t xml:space="preserve">— real estate management platform: public listing site and admin panel (Angular), realtor mobile app (Flutter), and Go/Gin + GORM APIs; Mercado Pago subscription billing</w:t>
+      </w:r>
+    </w:p>
+    <w:p>
+      <w:pPr>
+        <w:pStyle w:val="Compact"/>
+        <w:numPr>
+          <w:ilvl w:val="0"/>
+          <w:numId w:val="1009"/>
+        </w:numPr>
+      </w:pPr>
+      <w:r>
+        <w:rPr>
+          <w:b/>
+          <w:bCs/>
+        </w:rPr>
+        <w:t xml:space="preserve">Links</w:t>
+      </w:r>
+      <w:r>
+        <w:t xml:space="preserve"> </w:t>
+      </w:r>
+      <w:r>
+        <w:t xml:space="preserve">— link-in-bio SaaS with analytics and WhatsApp-ready Open Graph previews (Angular 22, Spring Boot 3.4 / Java 21, S3-compatible storage, Mercado Pago billing)</w:t>
+      </w:r>
+    </w:p>
+    <w:p>
+      <w:pPr>
+        <w:pStyle w:val="Compact"/>
+        <w:numPr>
+          <w:ilvl w:val="0"/>
+          <w:numId w:val="1009"/>
+        </w:numPr>
+      </w:pPr>
+      <w:r>
+        <w:rPr>
+          <w:b/>
+          <w:bCs/>
+        </w:rPr>
+        <w:t xml:space="preserve">MeuNutriFit</w:t>
+      </w:r>
+      <w:r>
+        <w:t xml:space="preserve"> </w:t>
+      </w:r>
+      <w:r>
+        <w:t xml:space="preserve">— nutrition tracking app (Flutter + Angular, FastAPI backend) with AI-based meal-photo analysis and PDF report generation</w:t>
+      </w:r>
+    </w:p>
+    <w:p>
+      <w:pPr>
+        <w:pStyle w:val="Compact"/>
+        <w:numPr>
+          <w:ilvl w:val="0"/>
+          <w:numId w:val="1009"/>
+        </w:numPr>
+      </w:pPr>
+      <w:r>
+        <w:rPr>
+          <w:b/>
+          <w:bCs/>
+        </w:rPr>
+        <w:t xml:space="preserve">Vitrine Corporativo</w:t>
+      </w:r>
+      <w:r>
+        <w:t xml:space="preserve"> </w:t>
+      </w:r>
+      <w:r>
+        <w:t xml:space="preserve">— dynamic corporate website builder (Next.js frontend, Go backend, Azure Blob + AWS S3 storage)</w:t>
+      </w:r>
+    </w:p>
+    <w:p>
+      <w:pPr>
+        <w:pStyle w:val="Compact"/>
+        <w:numPr>
+          <w:ilvl w:val="0"/>
+          <w:numId w:val="1009"/>
+        </w:numPr>
+      </w:pPr>
+      <w:r>
+        <w:rPr>
+          <w:b/>
+          <w:bCs/>
+        </w:rPr>
+        <w:t xml:space="preserve">ia-service</w:t>
+      </w:r>
+      <w:r>
+        <w:t xml:space="preserve"> </w:t>
+      </w:r>
+      <w:r>
+        <w:t xml:space="preserve">— internal Go microservice gateway unifying OpenAI, Anthropic, and Gemini APIs (text and image generation) for use across every product above</w:t>
+      </w:r>
+    </w:p>
+    <w:p>
+      <w:pPr>
+        <w:pStyle w:val="FirstParagraph"/>
+      </w:pPr>
+      <w:r>
+        <w:t xml:space="preserve">Infrastructure I designed and maintain: multi-schema PostgreSQL/MySQL databases shared across products, Docker Compose deployments, GitHub Actions CI/CD, and the observability stack described above.</w:t>
+      </w:r>
+    </w:p>
+    <w:p>
+      <w:pPr>
+        <w:pStyle w:val="BodyText"/>
+      </w:pPr>
+      <w:r>
+        <w:t xml:space="preserve">This project demonstrates product ownership, architecture design, and end-to-end system development across seven independent products and five languages/runtimes, beyond enterprise environments.</w:t>
+      </w:r>
+    </w:p>
+    <w:bookmarkEnd w:id="19"/>
+    <w:bookmarkEnd w:id="20"/>
+    <w:bookmarkStart w:id="27" w:name="professional-experience"/>
+    <w:p>
+      <w:pPr>
+        <w:pStyle w:val="Heading2"/>
+      </w:pPr>
+      <w:r>
+        <w:t xml:space="preserve">Professional Experience</w:t>
+      </w:r>
+    </w:p>
+    <w:bookmarkStart w:id="21" w:name="orla.tech---anbima"/>
+    <w:p>
+      <w:pPr>
+        <w:pStyle w:val="Heading3"/>
+      </w:pPr>
+      <w:r>
+        <w:t xml:space="preserve">Orla.tech - ANBIMA</w:t>
+      </w:r>
+    </w:p>
+    <w:p>
+      <w:pPr>
+        <w:pStyle w:val="FirstParagraph"/>
+      </w:pPr>
+      <w:r>
+        <w:rPr>
+          <w:b/>
+          <w:bCs/>
         </w:rPr>
         <w:t xml:space="preserve">Senior Backend Software Developer</w:t>
       </w:r>
@@ -930,11 +1107,11 @@
     </w:p>
     <w:p>
       <w:pPr>
+        <w:pStyle w:val="Compact"/>
         <w:numPr>
           <w:ilvl w:val="0"/>
           <w:numId w:val="1010"/>
         </w:numPr>
-        <w:pStyle w:val="Compact"/>
       </w:pPr>
       <w:r>
         <w:t xml:space="preserve">Acting at ANBIMA, one of the largest financial institutions in Brazil</w:t>
@@ -942,11 +1119,11 @@
     </w:p>
     <w:p>
       <w:pPr>
+        <w:pStyle w:val="Compact"/>
         <w:numPr>
           <w:ilvl w:val="0"/>
           <w:numId w:val="1010"/>
         </w:numPr>
-        <w:pStyle w:val="Compact"/>
       </w:pPr>
       <w:r>
         <w:t xml:space="preserve">Led a 3-developer team to build a file-processing architecture from scratch between Jul 2025 and Dec 2025</w:t>
@@ -954,11 +1131,11 @@
     </w:p>
     <w:p>
       <w:pPr>
+        <w:pStyle w:val="Compact"/>
         <w:numPr>
           <w:ilvl w:val="0"/>
           <w:numId w:val="1010"/>
         </w:numPr>
-        <w:pStyle w:val="Compact"/>
       </w:pPr>
       <w:r>
         <w:t xml:space="preserve">Defined and led the technical architecture using Java, AWS, Java Lambdas, Step Functions, S3, SQS, RDS, and Kubernetes</w:t>
@@ -966,11 +1143,11 @@
     </w:p>
     <w:p>
       <w:pPr>
+        <w:pStyle w:val="Compact"/>
         <w:numPr>
           <w:ilvl w:val="0"/>
           <w:numId w:val="1010"/>
         </w:numPr>
-        <w:pStyle w:val="Compact"/>
       </w:pPr>
       <w:r>
         <w:t xml:space="preserve">Led product understanding with stakeholders and translated complex requirements into clear implementation plans for the team</w:t>
@@ -978,25 +1155,25 @@
     </w:p>
     <w:p>
       <w:pPr>
+        <w:pStyle w:val="Compact"/>
         <w:numPr>
           <w:ilvl w:val="0"/>
           <w:numId w:val="1010"/>
         </w:numPr>
-        <w:pStyle w:val="Compact"/>
       </w:pPr>
       <w:r>
         <w:t xml:space="preserve">Simplified complex technical decisions and enabled faster delivery across the squad</w:t>
       </w:r>
     </w:p>
+    <w:bookmarkEnd w:id="21"/>
+    <w:bookmarkStart w:id="22" w:name="X6d4315bd179d35add7287fae26bcb28bb821011"/>
     <w:p>
       <w:pPr>
         <w:pStyle w:val="Heading3"/>
       </w:pPr>
-      <w:bookmarkStart w:id="35" w:name="X6d4315bd179d35add7287fae26bcb28bb821011"/>
       <w:r>
         <w:t xml:space="preserve">SPASSU - Brazilian Superior Court of Justice (STJ)</w:t>
       </w:r>
-      <w:bookmarkEnd w:id="35"/>
     </w:p>
     <w:p>
       <w:pPr>
@@ -1005,6 +1182,7 @@
       <w:r>
         <w:rPr>
           <w:b/>
+          <w:bCs/>
         </w:rPr>
         <w:t xml:space="preserve">Senior Full Stack Software Developer</w:t>
       </w:r>
@@ -1017,11 +1195,11 @@
     </w:p>
     <w:p>
       <w:pPr>
+        <w:pStyle w:val="Compact"/>
         <w:numPr>
           <w:ilvl w:val="0"/>
           <w:numId w:val="1011"/>
         </w:numPr>
-        <w:pStyle w:val="Compact"/>
       </w:pPr>
       <w:r>
         <w:t xml:space="preserve">Designed and implemented backend features using Java and TypeScript</w:t>
@@ -1029,11 +1207,11 @@
     </w:p>
     <w:p>
       <w:pPr>
+        <w:pStyle w:val="Compact"/>
         <w:numPr>
           <w:ilvl w:val="0"/>
           <w:numId w:val="1011"/>
         </w:numPr>
-        <w:pStyle w:val="Compact"/>
       </w:pPr>
       <w:r>
         <w:t xml:space="preserve">Improved maintainability by refactoring legacy components</w:t>
@@ -1041,11 +1219,11 @@
     </w:p>
     <w:p>
       <w:pPr>
+        <w:pStyle w:val="Compact"/>
         <w:numPr>
           <w:ilvl w:val="0"/>
           <w:numId w:val="1011"/>
         </w:numPr>
-        <w:pStyle w:val="Compact"/>
       </w:pPr>
       <w:r>
         <w:t xml:space="preserve">Implemented full automated testing coverage for new modules</w:t>
@@ -1053,25 +1231,25 @@
     </w:p>
     <w:p>
       <w:pPr>
+        <w:pStyle w:val="Compact"/>
         <w:numPr>
           <w:ilvl w:val="0"/>
           <w:numId w:val="1011"/>
         </w:numPr>
-        <w:pStyle w:val="Compact"/>
       </w:pPr>
       <w:r>
         <w:t xml:space="preserve">Collaborated directly with stakeholders to translate legal requirements into software systems</w:t>
       </w:r>
     </w:p>
+    <w:bookmarkEnd w:id="22"/>
+    <w:bookmarkStart w:id="23" w:name="nttdata---itau-bank"/>
     <w:p>
       <w:pPr>
         <w:pStyle w:val="Heading3"/>
       </w:pPr>
-      <w:bookmarkStart w:id="36" w:name="nttdata---itau-bank"/>
       <w:r>
         <w:t xml:space="preserve">NTTDATA - Itau Bank</w:t>
       </w:r>
-      <w:bookmarkEnd w:id="36"/>
     </w:p>
     <w:p>
       <w:pPr>
@@ -1080,6 +1258,7 @@
       <w:r>
         <w:rPr>
           <w:b/>
+          <w:bCs/>
         </w:rPr>
         <w:t xml:space="preserve">Senior Backend Software Developer</w:t>
       </w:r>
@@ -1092,11 +1271,11 @@
     </w:p>
     <w:p>
       <w:pPr>
+        <w:pStyle w:val="Compact"/>
         <w:numPr>
           <w:ilvl w:val="0"/>
           <w:numId w:val="1012"/>
         </w:numPr>
-        <w:pStyle w:val="Compact"/>
       </w:pPr>
       <w:r>
         <w:t xml:space="preserve">Built backend services in Java and Python for financial and agribusiness operations</w:t>
@@ -1104,11 +1283,11 @@
     </w:p>
     <w:p>
       <w:pPr>
+        <w:pStyle w:val="Compact"/>
         <w:numPr>
           <w:ilvl w:val="0"/>
           <w:numId w:val="1012"/>
         </w:numPr>
-        <w:pStyle w:val="Compact"/>
       </w:pPr>
       <w:r>
         <w:t xml:space="preserve">Developed AWS Lambda functions reducing operational costs</w:t>
@@ -1116,11 +1295,11 @@
     </w:p>
     <w:p>
       <w:pPr>
+        <w:pStyle w:val="Compact"/>
         <w:numPr>
           <w:ilvl w:val="0"/>
           <w:numId w:val="1012"/>
         </w:numPr>
-        <w:pStyle w:val="Compact"/>
       </w:pPr>
       <w:r>
         <w:t xml:space="preserve">Improved production observability through better logging and Splunk analysis</w:t>
@@ -1128,11 +1307,11 @@
     </w:p>
     <w:p>
       <w:pPr>
+        <w:pStyle w:val="Compact"/>
         <w:numPr>
           <w:ilvl w:val="0"/>
           <w:numId w:val="1012"/>
         </w:numPr>
-        <w:pStyle w:val="Compact"/>
       </w:pPr>
       <w:r>
         <w:t xml:space="preserve">Mentored junior developers and reinforced testing culture</w:t>
@@ -1140,25 +1319,25 @@
     </w:p>
     <w:p>
       <w:pPr>
+        <w:pStyle w:val="Compact"/>
         <w:numPr>
           <w:ilvl w:val="0"/>
           <w:numId w:val="1012"/>
         </w:numPr>
-        <w:pStyle w:val="Compact"/>
       </w:pPr>
       <w:r>
         <w:t xml:space="preserve">Worked with distributed systems and asynchronous processing</w:t>
       </w:r>
     </w:p>
+    <w:bookmarkEnd w:id="23"/>
+    <w:bookmarkStart w:id="24" w:name="betha-sistemas"/>
     <w:p>
       <w:pPr>
         <w:pStyle w:val="Heading3"/>
       </w:pPr>
-      <w:bookmarkStart w:id="37" w:name="betha-sistemas"/>
       <w:r>
         <w:t xml:space="preserve">Betha Sistemas</w:t>
       </w:r>
-      <w:bookmarkEnd w:id="37"/>
     </w:p>
     <w:p>
       <w:pPr>
@@ -1167,6 +1346,7 @@
       <w:r>
         <w:rPr>
           <w:b/>
+          <w:bCs/>
         </w:rPr>
         <w:t xml:space="preserve">Mid-level Full Stack Software Developer</w:t>
       </w:r>
@@ -1179,11 +1359,11 @@
     </w:p>
     <w:p>
       <w:pPr>
+        <w:pStyle w:val="Compact"/>
         <w:numPr>
           <w:ilvl w:val="0"/>
           <w:numId w:val="1013"/>
         </w:numPr>
-        <w:pStyle w:val="Compact"/>
       </w:pPr>
       <w:r>
         <w:t xml:space="preserve">Developed public management systems using Java and JavaScript</w:t>
@@ -1191,11 +1371,11 @@
     </w:p>
     <w:p>
       <w:pPr>
+        <w:pStyle w:val="Compact"/>
         <w:numPr>
           <w:ilvl w:val="0"/>
           <w:numId w:val="1013"/>
         </w:numPr>
-        <w:pStyle w:val="Compact"/>
       </w:pPr>
       <w:r>
         <w:t xml:space="preserve">Built and published a mobile app from scratch (Ionic)</w:t>
@@ -1203,11 +1383,11 @@
     </w:p>
     <w:p>
       <w:pPr>
+        <w:pStyle w:val="Compact"/>
         <w:numPr>
           <w:ilvl w:val="0"/>
           <w:numId w:val="1013"/>
         </w:numPr>
-        <w:pStyle w:val="Compact"/>
       </w:pPr>
       <w:r>
         <w:t xml:space="preserve">Deployed and monitored applications in Kubernetes environments</w:t>
@@ -1215,25 +1395,25 @@
     </w:p>
     <w:p>
       <w:pPr>
+        <w:pStyle w:val="Compact"/>
         <w:numPr>
           <w:ilvl w:val="0"/>
           <w:numId w:val="1013"/>
         </w:numPr>
-        <w:pStyle w:val="Compact"/>
       </w:pPr>
       <w:r>
         <w:t xml:space="preserve">Participated in production incident analysis and stability improvements</w:t>
       </w:r>
     </w:p>
+    <w:bookmarkEnd w:id="24"/>
+    <w:bookmarkStart w:id="25" w:name="sistema-info"/>
     <w:p>
       <w:pPr>
         <w:pStyle w:val="Heading3"/>
       </w:pPr>
-      <w:bookmarkStart w:id="38" w:name="sistema-info"/>
       <w:r>
         <w:t xml:space="preserve">Sistema Info</w:t>
       </w:r>
-      <w:bookmarkEnd w:id="38"/>
     </w:p>
     <w:p>
       <w:pPr>
@@ -1242,6 +1422,7 @@
       <w:r>
         <w:rPr>
           <w:b/>
+          <w:bCs/>
         </w:rPr>
         <w:t xml:space="preserve">Junior Full Stack Software Developer</w:t>
       </w:r>
@@ -1254,11 +1435,11 @@
     </w:p>
     <w:p>
       <w:pPr>
+        <w:pStyle w:val="Compact"/>
         <w:numPr>
           <w:ilvl w:val="0"/>
           <w:numId w:val="1014"/>
         </w:numPr>
-        <w:pStyle w:val="Compact"/>
       </w:pPr>
       <w:r>
         <w:t xml:space="preserve">Implemented logistics system features in C# and JavaScript</w:t>
@@ -1266,25 +1447,25 @@
     </w:p>
     <w:p>
       <w:pPr>
+        <w:pStyle w:val="Compact"/>
         <w:numPr>
           <w:ilvl w:val="0"/>
           <w:numId w:val="1014"/>
         </w:numPr>
-        <w:pStyle w:val="Compact"/>
       </w:pPr>
       <w:r>
         <w:t xml:space="preserve">Introduced unit testing practices into the team</w:t>
       </w:r>
     </w:p>
+    <w:bookmarkEnd w:id="25"/>
+    <w:bookmarkStart w:id="26" w:name="damyller"/>
     <w:p>
       <w:pPr>
         <w:pStyle w:val="Heading3"/>
       </w:pPr>
-      <w:bookmarkStart w:id="39" w:name="damyller"/>
       <w:r>
         <w:t xml:space="preserve">Damyller</w:t>
       </w:r>
-      <w:bookmarkEnd w:id="39"/>
     </w:p>
     <w:p>
       <w:pPr>
@@ -1293,6 +1474,7 @@
       <w:r>
         <w:rPr>
           <w:b/>
+          <w:bCs/>
         </w:rPr>
         <w:t xml:space="preserve">Desktop Software Developer and IT Support</w:t>
       </w:r>
@@ -1305,11 +1487,11 @@
     </w:p>
     <w:p>
       <w:pPr>
+        <w:pStyle w:val="Compact"/>
         <w:numPr>
           <w:ilvl w:val="0"/>
           <w:numId w:val="1015"/>
         </w:numPr>
-        <w:pStyle w:val="Compact"/>
       </w:pPr>
       <w:r>
         <w:t xml:space="preserve">Automated internal processes with C# desktop applications</w:t>
@@ -1317,11 +1499,11 @@
     </w:p>
     <w:p>
       <w:pPr>
+        <w:pStyle w:val="Compact"/>
         <w:numPr>
           <w:ilvl w:val="0"/>
           <w:numId w:val="1015"/>
         </w:numPr>
-        <w:pStyle w:val="Compact"/>
       </w:pPr>
       <w:r>
         <w:t xml:space="preserve">Built integrations between SQL databases and SAP systems</w:t>
@@ -1329,11 +1511,11 @@
     </w:p>
     <w:p>
       <w:pPr>
+        <w:pStyle w:val="Compact"/>
         <w:numPr>
           <w:ilvl w:val="0"/>
           <w:numId w:val="1015"/>
         </w:numPr>
-        <w:pStyle w:val="Compact"/>
       </w:pPr>
       <w:r>
         <w:t xml:space="preserve">Monitored company workstations and ensured operational stability</w:t>
@@ -1341,11 +1523,11 @@
     </w:p>
     <w:p>
       <w:pPr>
+        <w:pStyle w:val="Compact"/>
         <w:numPr>
           <w:ilvl w:val="0"/>
           <w:numId w:val="1015"/>
         </w:numPr>
-        <w:pStyle w:val="Compact"/>
       </w:pPr>
       <w:r>
         <w:t xml:space="preserve">Installed and updated software across user machines</w:t>
@@ -1353,35 +1535,35 @@
     </w:p>
     <w:p>
       <w:pPr>
+        <w:pStyle w:val="Compact"/>
         <w:numPr>
           <w:ilvl w:val="0"/>
           <w:numId w:val="1015"/>
         </w:numPr>
-        <w:pStyle w:val="Compact"/>
       </w:pPr>
       <w:r>
         <w:t xml:space="preserve">Provided user support via phone, chat, and an internal help desk tool</w:t>
       </w:r>
     </w:p>
+    <w:bookmarkEnd w:id="26"/>
+    <w:bookmarkEnd w:id="27"/>
+    <w:bookmarkStart w:id="29" w:name="education"/>
     <w:p>
       <w:pPr>
         <w:pStyle w:val="Heading2"/>
       </w:pPr>
-      <w:bookmarkStart w:id="40" w:name="education"/>
       <w:r>
         <w:t xml:space="preserve">Education</w:t>
       </w:r>
-      <w:bookmarkEnd w:id="40"/>
-    </w:p>
+    </w:p>
+    <w:bookmarkStart w:id="28" w:name="bachelors-degree-in-information-systems"/>
     <w:p>
       <w:pPr>
         <w:pStyle w:val="Heading3"/>
       </w:pPr>
-      <w:bookmarkStart w:id="41" w:name="bachelors-degree-in-information-systems"/>
       <w:r>
         <w:t xml:space="preserve">Bachelor’s Degree in Information Systems</w:t>
       </w:r>
-      <w:bookmarkEnd w:id="41"/>
     </w:p>
     <w:p>
       <w:pPr>
@@ -1391,45 +1573,46 @@
         <w:t xml:space="preserve">ESUCRI - 2015-2019</w:t>
       </w:r>
     </w:p>
+    <w:bookmarkEnd w:id="28"/>
+    <w:bookmarkEnd w:id="29"/>
+    <w:bookmarkStart w:id="30" w:name="certifications"/>
     <w:p>
       <w:pPr>
         <w:pStyle w:val="Heading2"/>
       </w:pPr>
-      <w:bookmarkStart w:id="42" w:name="certifications"/>
       <w:r>
         <w:t xml:space="preserve">Certifications</w:t>
       </w:r>
-      <w:bookmarkEnd w:id="42"/>
-    </w:p>
-    <w:p>
-      <w:pPr>
+    </w:p>
+    <w:p>
+      <w:pPr>
+        <w:pStyle w:val="Compact"/>
         <w:numPr>
           <w:ilvl w:val="0"/>
           <w:numId w:val="1016"/>
         </w:numPr>
-        <w:pStyle w:val="Compact"/>
       </w:pPr>
       <w:r>
         <w:t xml:space="preserve">AWS Certified Cloud Practitioner (2022)</w:t>
       </w:r>
     </w:p>
+    <w:bookmarkEnd w:id="30"/>
+    <w:bookmarkStart w:id="31" w:name="languages"/>
     <w:p>
       <w:pPr>
         <w:pStyle w:val="Heading2"/>
       </w:pPr>
-      <w:bookmarkStart w:id="43" w:name="languages"/>
       <w:r>
         <w:t xml:space="preserve">Languages</w:t>
       </w:r>
-      <w:bookmarkEnd w:id="43"/>
-    </w:p>
-    <w:p>
-      <w:pPr>
+    </w:p>
+    <w:p>
+      <w:pPr>
+        <w:pStyle w:val="Compact"/>
         <w:numPr>
           <w:ilvl w:val="0"/>
           <w:numId w:val="1017"/>
         </w:numPr>
-        <w:pStyle w:val="Compact"/>
       </w:pPr>
       <w:r>
         <w:t xml:space="preserve">Portuguese: Native</w:t>
@@ -1437,17 +1620,23 @@
     </w:p>
     <w:p>
       <w:pPr>
+        <w:pStyle w:val="Compact"/>
         <w:numPr>
           <w:ilvl w:val="0"/>
           <w:numId w:val="1017"/>
         </w:numPr>
-        <w:pStyle w:val="Compact"/>
       </w:pPr>
       <w:r>
         <w:t xml:space="preserve">English: Fluent</w:t>
       </w:r>
     </w:p>
-    <w:sectPr/>
+    <w:bookmarkEnd w:id="31"/>
+    <w:bookmarkEnd w:id="32"/>
+    <w:sectPr>
+      <w:footnotePr>
+        <w:numRestart w:val="eachSect"/>
+      </w:footnotePr>
+    </w:sectPr>
   </w:body>
 </w:document>
 </file>
@@ -1478,17 +1667,14 @@
 <file path=word/numbering.xml><?xml version="1.0" encoding="utf-8"?>
 <w:numbering xmlns:w="http://schemas.openxmlformats.org/wordprocessingml/2006/main">
   <w:abstractNum w:abstractNumId="990">
-    <w:nsid w:val="2c1ae401"/>
+    <w:nsid w:val="0000A990"/>
     <w:multiLevelType w:val="multilevel"/>
     <w:lvl w:ilvl="0">
       <w:numFmt w:val="bullet"/>
       <w:lvlText w:val=" "/>
       <w:lvlJc w:val="left"/>
       <w:pPr>
-        <w:tabs>
-          <w:tab w:val="num" w:pos="0"/>
-        </w:tabs>
-        <w:ind w:left="480" w:hanging="480"/>
+        <w:ind w:left="720" w:hanging="360"/>
       </w:pPr>
     </w:lvl>
     <w:lvl w:ilvl="1">
@@ -1496,10 +1682,7 @@
       <w:lvlText w:val=" "/>
       <w:lvlJc w:val="left"/>
       <w:pPr>
-        <w:tabs>
-          <w:tab w:val="num" w:pos="720"/>
-        </w:tabs>
-        <w:ind w:left="1200" w:hanging="480"/>
+        <w:ind w:left="1440" w:hanging="360"/>
       </w:pPr>
     </w:lvl>
     <w:lvl w:ilvl="2">
@@ -1507,10 +1690,7 @@
       <w:lvlText w:val=" "/>
       <w:lvlJc w:val="left"/>
       <w:pPr>
-        <w:tabs>
-          <w:tab w:val="num" w:pos="1440"/>
-        </w:tabs>
-        <w:ind w:left="1920" w:hanging="480"/>
+        <w:ind w:left="2160" w:hanging="360"/>
       </w:pPr>
     </w:lvl>
     <w:lvl w:ilvl="3">
@@ -1518,10 +1698,7 @@
       <w:lvlText w:val=" "/>
       <w:lvlJc w:val="left"/>
       <w:pPr>
-        <w:tabs>
-          <w:tab w:val="num" w:pos="2160"/>
-        </w:tabs>
-        <w:ind w:left="2640" w:hanging="480"/>
+        <w:ind w:left="2880" w:hanging="360"/>
       </w:pPr>
     </w:lvl>
     <w:lvl w:ilvl="4">
@@ -1529,10 +1706,7 @@
       <w:lvlText w:val=" "/>
       <w:lvlJc w:val="left"/>
       <w:pPr>
-        <w:tabs>
-          <w:tab w:val="num" w:pos="2880"/>
-        </w:tabs>
-        <w:ind w:left="3360" w:hanging="480"/>
+        <w:ind w:left="3600" w:hanging="360"/>
       </w:pPr>
     </w:lvl>
     <w:lvl w:ilvl="5">
@@ -1540,10 +1714,7 @@
       <w:lvlText w:val=" "/>
       <w:lvlJc w:val="left"/>
       <w:pPr>
-        <w:tabs>
-          <w:tab w:val="num" w:pos="3600"/>
-        </w:tabs>
-        <w:ind w:left="4080" w:hanging="480"/>
+        <w:ind w:left="4320" w:hanging="360"/>
       </w:pPr>
     </w:lvl>
     <w:lvl w:ilvl="6">
@@ -1551,10 +1722,7 @@
       <w:lvlText w:val=" "/>
       <w:lvlJc w:val="left"/>
       <w:pPr>
-        <w:tabs>
-          <w:tab w:val="num" w:pos="4320"/>
-        </w:tabs>
-        <w:ind w:left="4800" w:hanging="480"/>
+        <w:ind w:left="5040" w:hanging="360"/>
       </w:pPr>
     </w:lvl>
     <w:lvl w:ilvl="7">
@@ -1562,10 +1730,7 @@
       <w:lvlText w:val=" "/>
       <w:lvlJc w:val="left"/>
       <w:pPr>
-        <w:tabs>
-          <w:tab w:val="num" w:pos="5040"/>
-        </w:tabs>
-        <w:ind w:left="5520" w:hanging="480"/>
+        <w:ind w:left="5760" w:hanging="360"/>
       </w:pPr>
     </w:lvl>
     <w:lvl w:ilvl="8">
@@ -1573,114 +1738,111 @@
       <w:lvlText w:val=" "/>
       <w:lvlJc w:val="left"/>
       <w:pPr>
-        <w:tabs>
-          <w:tab w:val="num" w:pos="5760"/>
-        </w:tabs>
-        <w:ind w:left="6240" w:hanging="480"/>
+        <w:ind w:left="6480" w:hanging="360"/>
       </w:pPr>
     </w:lvl>
   </w:abstractNum>
   <w:abstractNum w:abstractNumId="991">
-    <w:nsid w:val="ea454b4c"/>
+    <w:nsid w:val="0000A991"/>
     <w:multiLevelType w:val="multilevel"/>
     <w:lvl w:ilvl="0">
       <w:numFmt w:val="bullet"/>
-      <w:lvlText w:val="•"/>
+      <w:lvlText w:val=""/>
       <w:lvlJc w:val="left"/>
       <w:pPr>
-        <w:tabs>
-          <w:tab w:val="num" w:pos="0"/>
-        </w:tabs>
-        <w:ind w:left="480" w:hanging="480"/>
-      </w:pPr>
+        <w:ind w:left="720" w:hanging="360"/>
+      </w:pPr>
+      <w:rPr>
+        <w:rFonts w:ascii="Symbol" w:hAnsi="Symbol" w:cs="Symbol" w:hint="default"/>
+      </w:rPr>
     </w:lvl>
     <w:lvl w:ilvl="1">
       <w:numFmt w:val="bullet"/>
-      <w:lvlText w:val="–"/>
+      <w:lvlText w:val="o"/>
       <w:lvlJc w:val="left"/>
       <w:pPr>
-        <w:tabs>
-          <w:tab w:val="num" w:pos="720"/>
-        </w:tabs>
-        <w:ind w:left="1200" w:hanging="480"/>
-      </w:pPr>
+        <w:ind w:left="1440" w:hanging="360"/>
+      </w:pPr>
+      <w:rPr>
+        <w:rFonts w:ascii="Courier New" w:hAnsi="Courier New" w:cs="Courier New" w:hint="default"/>
+      </w:rPr>
     </w:lvl>
     <w:lvl w:ilvl="2">
       <w:numFmt w:val="bullet"/>
-      <w:lvlText w:val="•"/>
+      <w:lvlText w:val=""/>
       <w:lvlJc w:val="left"/>
       <w:pPr>
-        <w:tabs>
-          <w:tab w:val="num" w:pos="1440"/>
-        </w:tabs>
-        <w:ind w:left="1920" w:hanging="480"/>
-      </w:pPr>
+        <w:ind w:left="2160" w:hanging="360"/>
+      </w:pPr>
+      <w:rPr>
+        <w:rFonts w:ascii="Wingdings" w:hAnsi="Wingdings" w:cs="Wingdings" w:hint="default"/>
+      </w:rPr>
     </w:lvl>
     <w:lvl w:ilvl="3">
       <w:numFmt w:val="bullet"/>
-      <w:lvlText w:val="–"/>
+      <w:lvlText w:val=""/>
       <w:lvlJc w:val="left"/>
       <w:pPr>
-        <w:tabs>
-          <w:tab w:val="num" w:pos="2160"/>
-        </w:tabs>
-        <w:ind w:left="2640" w:hanging="480"/>
-      </w:pPr>
+        <w:ind w:left="2880" w:hanging="360"/>
+      </w:pPr>
+      <w:rPr>
+        <w:rFonts w:ascii="Symbol" w:hAnsi="Symbol" w:cs="Symbol" w:hint="default"/>
+      </w:rPr>
     </w:lvl>
     <w:lvl w:ilvl="4">
       <w:numFmt w:val="bullet"/>
-      <w:lvlText w:val="•"/>
+      <w:lvlText w:val="o"/>
       <w:lvlJc w:val="left"/>
       <w:pPr>
-        <w:tabs>
-          <w:tab w:val="num" w:pos="2880"/>
-        </w:tabs>
-        <w:ind w:left="3360" w:hanging="480"/>
-      </w:pPr>
+        <w:ind w:left="3600" w:hanging="360"/>
+      </w:pPr>
+      <w:rPr>
+        <w:rFonts w:ascii="Courier New" w:hAnsi="Courier New" w:cs="Courier New" w:hint="default"/>
+      </w:rPr>
     </w:lvl>
     <w:lvl w:ilvl="5">
       <w:numFmt w:val="bullet"/>
-      <w:lvlText w:val="–"/>
+      <w:lvlText w:val=""/>
       <w:lvlJc w:val="left"/>
       <w:pPr>
-        <w:tabs>
-          <w:tab w:val="num" w:pos="3600"/>
-        </w:tabs>
-        <w:ind w:left="4080" w:hanging="480"/>
-      </w:pPr>
+        <w:ind w:left="4320" w:hanging="360"/>
+      </w:pPr>
+      <w:rPr>
+        <w:rFonts w:ascii="Wingdings" w:hAnsi="Wingdings" w:cs="Wingdings" w:hint="default"/>
+      </w:rPr>
     </w:lvl>
     <w:lvl w:ilvl="6">
       <w:numFmt w:val="bullet"/>
-      <w:lvlText w:val="•"/>
+      <w:lvlText w:val=""/>
       <w:lvlJc w:val="left"/>
       <w:pPr>
-        <w:tabs>
-          <w:tab w:val="num" w:pos="4320"/>
-        </w:tabs>
-        <w:ind w:left="4800" w:hanging="480"/>
-      </w:pPr>
+        <w:ind w:left="5040" w:hanging="360"/>
+      </w:pPr>
+      <w:rPr>
+        <w:rFonts w:ascii="Symbol" w:hAnsi="Symbol" w:cs="Symbol" w:hint="default"/>
+      </w:rPr>
     </w:lvl>
     <w:lvl w:ilvl="7">
       <w:numFmt w:val="bullet"/>
-      <w:lvlText w:val="–"/>
+      <w:lvlText w:val="o"/>
       <w:lvlJc w:val="left"/>
       <w:pPr>
-        <w:tabs>
-          <w:tab w:val="num" w:pos="5040"/>
-        </w:tabs>
-        <w:ind w:left="5520" w:hanging="480"/>
-      </w:pPr>
+        <w:ind w:left="5760" w:hanging="360"/>
+      </w:pPr>
+      <w:rPr>
+        <w:rFonts w:ascii="Courier New" w:hAnsi="Courier New" w:cs="Courier New" w:hint="default"/>
+      </w:rPr>
     </w:lvl>
     <w:lvl w:ilvl="8">
       <w:numFmt w:val="bullet"/>
-      <w:lvlText w:val="•"/>
+      <w:lvlText w:val=""/>
       <w:lvlJc w:val="left"/>
       <w:pPr>
-        <w:tabs>
-          <w:tab w:val="num" w:pos="5760"/>
-        </w:tabs>
-        <w:ind w:left="6240" w:hanging="480"/>
-      </w:pPr>
+        <w:ind w:left="6480" w:hanging="360"/>
+      </w:pPr>
+      <w:rPr>
+        <w:rFonts w:ascii="Wingdings" w:hAnsi="Wingdings" w:cs="Wingdings" w:hint="default"/>
+      </w:rPr>
     </w:lvl>
   </w:abstractNum>
   <w:num w:numId="1000">
@@ -1745,10 +1907,10 @@
   <w:docDefaults>
     <w:rPrDefault>
       <w:rPr>
-        <w:rFonts w:asciiTheme="minorHAnsi" w:eastAsiaTheme="minorHAnsi" w:hAnsiTheme="minorHAnsi" w:cstheme="minorBidi"/>
+        <w:rFonts w:asciiTheme="minorHAnsi" w:cstheme="minorBidi" w:eastAsiaTheme="minorEastAsia" w:hAnsiTheme="minorHAnsi"/>
         <w:sz w:val="24"/>
         <w:szCs w:val="24"/>
-        <w:lang w:val="en-US" w:eastAsia="en-US" w:bidi="ar-SA"/>
+        <w:lang w:bidi="ar-SA" w:eastAsia="zh-CN" w:val="en-US"/>
       </w:rPr>
     </w:rPrDefault>
     <w:pPrDefault>
@@ -1757,91 +1919,145 @@
       </w:pPr>
     </w:pPrDefault>
   </w:docDefaults>
-  <w:latentStyles w:defLockedState="0" w:defUIPriority="0" w:defSemiHidden="0" w:defUnhideWhenUsed="0" w:defQFormat="0" w:count="276"/>
-  <w:style w:type="paragraph" w:default="1" w:styleId="Normal">
+  <w:latentStyles w:count="276" w:defLockedState="0" w:defQFormat="0" w:defSemiHidden="0" w:defUIPriority="0" w:defUnhideWhenUsed="0"/>
+  <w:style w:default="1" w:styleId="Normal" w:type="paragraph">
     <w:name w:val="Normal"/>
     <w:qFormat/>
   </w:style>
-  <w:style w:type="paragraph" w:styleId="BodyText">
+  <w:style w:styleId="BodyText" w:type="paragraph">
     <w:name w:val="Body Text"/>
     <w:basedOn w:val="Normal"/>
     <w:link w:val="BodyTextChar"/>
+    <w:qFormat/>
     <w:pPr>
-      <w:spacing w:before="180" w:after="180"/>
+      <w:spacing w:after="180" w:before="180"/>
     </w:pPr>
-    <w:qFormat/>
-  </w:style>
-  <w:style w:type="paragraph" w:customStyle="1" w:styleId="FirstParagraph">
+  </w:style>
+  <w:style w:customStyle="1" w:styleId="FirstParagraph" w:type="paragraph">
     <w:name w:val="First Paragraph"/>
     <w:basedOn w:val="BodyText"/>
     <w:next w:val="BodyText"/>
     <w:qFormat/>
   </w:style>
-  <w:style w:type="paragraph" w:customStyle="1" w:styleId="Compact">
+  <w:style w:customStyle="1" w:styleId="Compact" w:type="paragraph">
     <w:name w:val="Compact"/>
     <w:basedOn w:val="BodyText"/>
     <w:qFormat/>
     <w:pPr>
-      <w:spacing w:before="36" w:after="36"/>
+      <w:spacing w:after="36" w:before="36"/>
     </w:pPr>
   </w:style>
-  <w:style w:type="paragraph" w:styleId="Title">
+  <w:style w:styleId="Title" w:type="paragraph">
     <w:name w:val="Title"/>
     <w:basedOn w:val="Normal"/>
     <w:next w:val="BodyText"/>
+    <w:link w:val="TitleChar"/>
+    <w:uiPriority w:val="10"/>
     <w:qFormat/>
+    <w:rsid w:val="00A10FD9"/>
     <w:pPr>
-      <w:keepNext/>
-      <w:keepLines/>
-      <w:spacing w:before="480" w:after="240"/>
+      <w:spacing w:after="80" w:line="240" w:lineRule="auto"/>
+      <w:contextualSpacing/>
       <w:jc w:val="center"/>
     </w:pPr>
     <w:rPr>
-      <w:rFonts w:asciiTheme="majorHAnsi" w:eastAsiaTheme="majorEastAsia" w:hAnsiTheme="majorHAnsi" w:cstheme="majorBidi"/>
-      <w:b/>
-      <w:bCs/>
-      <w:color w:val="345A8A" w:themeColor="accent1" w:themeShade="B5"/>
-      <w:sz w:val="36"/>
-      <w:szCs w:val="36"/>
-    </w:rPr>
-  </w:style>
-  <w:style w:type="paragraph" w:styleId="Subtitle">
+      <w:rFonts w:asciiTheme="majorHAnsi" w:cstheme="majorBidi" w:eastAsiaTheme="majorEastAsia" w:hAnsiTheme="majorHAnsi"/>
+      <w:sz w:val="56"/>
+      <w:szCs w:val="56"/>
+    </w:rPr>
+  </w:style>
+  <w:style w:customStyle="1" w:styleId="TitleChar" w:type="character">
+    <w:name w:val="Title Char"/>
+    <w:basedOn w:val="DefaultParagraphFont"/>
+    <w:link w:val="Title"/>
+    <w:uiPriority w:val="10"/>
+    <w:rsid w:val="00A10FD9"/>
+    <w:rPr>
+      <w:rFonts w:asciiTheme="majorHAnsi" w:cstheme="majorBidi" w:eastAsiaTheme="majorEastAsia" w:hAnsiTheme="majorHAnsi"/>
+      <w:sz w:val="56"/>
+      <w:szCs w:val="56"/>
+    </w:rPr>
+  </w:style>
+  <w:style w:styleId="Subtitle" w:type="paragraph">
     <w:name w:val="Subtitle"/>
+    <w:basedOn w:val="Title"/>
+    <w:next w:val="BodyText"/>
+    <w:link w:val="SubtitleChar"/>
+    <w:uiPriority w:val="11"/>
+    <w:qFormat/>
+    <w:rsid w:val="00A10FD9"/>
+    <w:pPr>
+      <w:numPr>
+        <w:ilvl w:val="1"/>
+      </w:numPr>
+    </w:pPr>
+    <w:rPr>
+      <w:rFonts w:cstheme="majorBidi" w:eastAsiaTheme="majorEastAsia"/>
+      <w:spacing w:val="15"/>
+      <w:sz w:val="28"/>
+      <w:szCs w:val="28"/>
+    </w:rPr>
+  </w:style>
+  <w:style w:customStyle="1" w:styleId="SubtitleChar" w:type="character">
+    <w:name w:val="Subtitle Char"/>
+    <w:basedOn w:val="DefaultParagraphFont"/>
+    <w:link w:val="Subtitle"/>
+    <w:uiPriority w:val="11"/>
+    <w:rsid w:val="00A10FD9"/>
+    <w:rPr>
+      <w:rFonts w:cstheme="majorBidi" w:eastAsiaTheme="majorEastAsia"/>
+      <w:color w:themeColor="text1" w:themeTint="A6" w:val="595959"/>
+      <w:spacing w:val="15"/>
+      <w:sz w:val="28"/>
+      <w:szCs w:val="28"/>
+    </w:rPr>
+  </w:style>
+  <w:style w:customStyle="1" w:styleId="Author" w:type="paragraph">
+    <w:name w:val="Author"/>
     <w:basedOn w:val="Title"/>
     <w:next w:val="BodyText"/>
     <w:qFormat/>
     <w:pPr>
       <w:keepNext/>
       <w:keepLines/>
-      <w:spacing w:before="240" w:after="240"/>
-      <w:jc w:val="center"/>
     </w:pPr>
     <w:rPr>
-      <w:sz w:val="30"/>
-      <w:szCs w:val="30"/>
-    </w:rPr>
-  </w:style>
-  <w:style w:type="paragraph" w:customStyle="1" w:styleId="Author">
-    <w:name w:val="Author"/>
+      <w:sz w:val="24"/>
+      <w:szCs w:val="24"/>
+    </w:rPr>
+  </w:style>
+  <w:style w:styleId="Date" w:type="paragraph">
+    <w:name w:val="Date"/>
+    <w:basedOn w:val="Title"/>
     <w:next w:val="BodyText"/>
     <w:qFormat/>
     <w:pPr>
       <w:keepNext/>
       <w:keepLines/>
-      <w:jc w:val="center"/>
     </w:pPr>
-  </w:style>
-  <w:style w:type="paragraph" w:styleId="Date">
-    <w:name w:val="Date"/>
-    <w:next w:val="BodyText"/>
+    <w:rPr>
+      <w:sz w:val="24"/>
+      <w:szCs w:val="24"/>
+    </w:rPr>
+  </w:style>
+  <w:style w:customStyle="1" w:styleId="AbstractTitle" w:type="paragraph">
+    <w:name w:val="Abstract Title"/>
+    <w:basedOn w:val="Normal"/>
+    <w:next w:val="Abstract"/>
     <w:qFormat/>
     <w:pPr>
       <w:keepNext/>
       <w:keepLines/>
+      <w:spacing w:after="0" w:before="300"/>
       <w:jc w:val="center"/>
     </w:pPr>
-  </w:style>
-  <w:style w:type="paragraph" w:customStyle="1" w:styleId="Abstract">
+    <w:rPr>
+      <w:b/>
+      <w:sz w:val="20"/>
+      <w:szCs w:val="20"/>
+    </w:rPr>
+  </w:style>
+  <w:style w:customStyle="1" w:styleId="Abstract" w:type="paragraph">
     <w:name w:val="Abstract"/>
     <w:basedOn w:val="Normal"/>
     <w:next w:val="BodyText"/>
@@ -1849,14 +2065,14 @@
     <w:pPr>
       <w:keepNext/>
       <w:keepLines/>
-      <w:spacing w:before="300" w:after="300"/>
+      <w:spacing w:after="300" w:before="100"/>
     </w:pPr>
     <w:rPr>
       <w:sz w:val="20"/>
       <w:szCs w:val="20"/>
     </w:rPr>
   </w:style>
-  <w:style w:type="paragraph" w:styleId="Bibliography">
+  <w:style w:styleId="Bibliography" w:type="paragraph">
     <w:name w:val="Bibliography"/>
     <w:basedOn w:val="Normal"/>
     <w:next w:val="Bibliography"/>
@@ -1864,195 +2080,325 @@
     <w:pPr/>
     <w:rPr/>
   </w:style>
-  <w:style w:type="paragraph" w:styleId="Heading1">
-    <w:name w:val="Heading 1"/>
+  <w:style w:styleId="Heading1" w:type="paragraph">
+    <w:name w:val="heading 1"/>
     <w:basedOn w:val="Normal"/>
     <w:next w:val="BodyText"/>
+    <w:link w:val="Heading1Char"/>
     <w:uiPriority w:val="9"/>
     <w:qFormat/>
+    <w:rsid w:val="00A10FD9"/>
     <w:pPr>
       <w:keepNext/>
       <w:keepLines/>
-      <w:spacing w:before="480" w:after="0"/>
+      <w:spacing w:after="80" w:before="360"/>
       <w:outlineLvl w:val="0"/>
     </w:pPr>
     <w:rPr>
-      <w:rFonts w:asciiTheme="majorHAnsi" w:eastAsiaTheme="majorEastAsia" w:hAnsiTheme="majorHAnsi" w:cstheme="majorBidi"/>
-      <w:b/>
-      <w:bCs/>
-      <w:color w:val="4F81BD" w:themeColor="accent1"/>
-      <w:sz w:val="32"/>
-      <w:szCs w:val="32"/>
-    </w:rPr>
-  </w:style>
-  <w:style w:type="paragraph" w:styleId="Heading2">
-    <w:name w:val="Heading 2"/>
+      <w:rFonts w:asciiTheme="majorHAnsi" w:cstheme="majorBidi" w:eastAsiaTheme="majorEastAsia" w:hAnsiTheme="majorHAnsi"/>
+      <w:color w:themeColor="accent1" w:themeShade="BF" w:val="0F4761"/>
+      <w:sz w:val="40"/>
+      <w:szCs w:val="40"/>
+    </w:rPr>
+  </w:style>
+  <w:style w:styleId="Heading2" w:type="paragraph">
+    <w:name w:val="heading 2"/>
     <w:basedOn w:val="Normal"/>
     <w:next w:val="BodyText"/>
+    <w:link w:val="Heading2Char"/>
     <w:uiPriority w:val="9"/>
+    <w:semiHidden/>
     <w:unhideWhenUsed/>
     <w:qFormat/>
+    <w:rsid w:val="00A10FD9"/>
     <w:pPr>
       <w:keepNext/>
       <w:keepLines/>
-      <w:spacing w:before="200" w:after="0"/>
+      <w:spacing w:after="80" w:before="160"/>
       <w:outlineLvl w:val="1"/>
     </w:pPr>
     <w:rPr>
-      <w:rFonts w:asciiTheme="majorHAnsi" w:eastAsiaTheme="majorEastAsia" w:hAnsiTheme="majorHAnsi" w:cstheme="majorBidi"/>
-      <w:b/>
-      <w:bCs/>
-      <w:color w:val="4F81BD" w:themeColor="accent1"/>
-      <w:sz w:val="28"/>
-      <w:szCs w:val="28"/>
-    </w:rPr>
-  </w:style>
-  <w:style w:type="paragraph" w:styleId="Heading3">
-    <w:name w:val="Heading 3"/>
+      <w:rFonts w:asciiTheme="majorHAnsi" w:cstheme="majorBidi" w:eastAsiaTheme="majorEastAsia" w:hAnsiTheme="majorHAnsi"/>
+      <w:color w:themeColor="accent1" w:themeShade="BF" w:val="0F4761"/>
+      <w:sz w:val="32"/>
+      <w:szCs w:val="32"/>
+    </w:rPr>
+  </w:style>
+  <w:style w:styleId="Heading3" w:type="paragraph">
+    <w:name w:val="heading 3"/>
     <w:basedOn w:val="Normal"/>
     <w:next w:val="BodyText"/>
+    <w:link w:val="Heading3Char"/>
     <w:uiPriority w:val="9"/>
+    <w:semiHidden/>
     <w:unhideWhenUsed/>
     <w:qFormat/>
+    <w:rsid w:val="00A10FD9"/>
     <w:pPr>
       <w:keepNext/>
       <w:keepLines/>
-      <w:spacing w:before="200" w:after="0"/>
+      <w:spacing w:after="80" w:before="160"/>
       <w:outlineLvl w:val="2"/>
     </w:pPr>
     <w:rPr>
-      <w:rFonts w:asciiTheme="majorHAnsi" w:eastAsiaTheme="majorEastAsia" w:hAnsiTheme="majorHAnsi" w:cstheme="majorBidi"/>
-      <w:b/>
-      <w:bCs/>
-      <w:color w:val="4F81BD" w:themeColor="accent1"/>
-      <w:sz w:val="24"/>
-      <w:szCs w:val="24"/>
-    </w:rPr>
-  </w:style>
-  <w:style w:type="paragraph" w:styleId="Heading4">
-    <w:name w:val="Heading 4"/>
+      <w:rFonts w:cstheme="majorBidi" w:eastAsiaTheme="majorEastAsia"/>
+      <w:color w:themeColor="accent1" w:themeShade="BF" w:val="0F4761"/>
+      <w:sz w:val="28"/>
+      <w:szCs w:val="28"/>
+    </w:rPr>
+  </w:style>
+  <w:style w:styleId="Heading4" w:type="paragraph">
+    <w:name w:val="heading 4"/>
     <w:basedOn w:val="Normal"/>
     <w:next w:val="BodyText"/>
+    <w:link w:val="Heading4Char"/>
     <w:uiPriority w:val="9"/>
+    <w:semiHidden/>
     <w:unhideWhenUsed/>
     <w:qFormat/>
+    <w:rsid w:val="00A10FD9"/>
     <w:pPr>
       <w:keepNext/>
       <w:keepLines/>
-      <w:spacing w:before="200" w:after="0"/>
+      <w:spacing w:after="40" w:before="80"/>
       <w:outlineLvl w:val="3"/>
     </w:pPr>
     <w:rPr>
-      <w:rFonts w:asciiTheme="majorHAnsi" w:eastAsiaTheme="majorEastAsia" w:hAnsiTheme="majorHAnsi" w:cstheme="majorBidi"/>
+      <w:rFonts w:cstheme="majorBidi" w:eastAsiaTheme="majorEastAsia"/>
       <w:i/>
-      <w:bCs/>
-      <w:color w:val="4F81BD" w:themeColor="accent1"/>
-      <w:sz w:val="24"/>
-      <w:szCs w:val="24"/>
-    </w:rPr>
-  </w:style>
-  <w:style w:type="paragraph" w:styleId="Heading5">
-    <w:name w:val="Heading 5"/>
+      <w:iCs/>
+      <w:color w:themeColor="accent1" w:themeShade="BF" w:val="0F4761"/>
+    </w:rPr>
+  </w:style>
+  <w:style w:styleId="Heading5" w:type="paragraph">
+    <w:name w:val="heading 5"/>
     <w:basedOn w:val="Normal"/>
     <w:next w:val="BodyText"/>
+    <w:link w:val="Heading5Char"/>
     <w:uiPriority w:val="9"/>
+    <w:semiHidden/>
     <w:unhideWhenUsed/>
     <w:qFormat/>
+    <w:rsid w:val="00A10FD9"/>
     <w:pPr>
       <w:keepNext/>
       <w:keepLines/>
-      <w:spacing w:before="200" w:after="0"/>
+      <w:spacing w:after="40" w:before="80"/>
       <w:outlineLvl w:val="4"/>
     </w:pPr>
     <w:rPr>
-      <w:rFonts w:asciiTheme="majorHAnsi" w:eastAsiaTheme="majorEastAsia" w:hAnsiTheme="majorHAnsi" w:cstheme="majorBidi"/>
-      <w:iCs/>
-      <w:color w:val="4F81BD" w:themeColor="accent1"/>
-      <w:sz w:val="24"/>
-      <w:szCs w:val="24"/>
-    </w:rPr>
-  </w:style>
-  <w:style w:type="paragraph" w:styleId="Heading6">
-    <w:name w:val="Heading 6"/>
+      <w:rFonts w:cstheme="majorBidi" w:eastAsiaTheme="majorEastAsia"/>
+      <w:color w:themeColor="accent1" w:themeShade="BF" w:val="0F4761"/>
+    </w:rPr>
+  </w:style>
+  <w:style w:styleId="Heading6" w:type="paragraph">
+    <w:name w:val="heading 6"/>
     <w:basedOn w:val="Normal"/>
     <w:next w:val="BodyText"/>
+    <w:link w:val="Heading6Char"/>
     <w:uiPriority w:val="9"/>
+    <w:semiHidden/>
     <w:unhideWhenUsed/>
     <w:qFormat/>
+    <w:rsid w:val="00A10FD9"/>
     <w:pPr>
       <w:keepNext/>
       <w:keepLines/>
-      <w:spacing w:before="200" w:after="0"/>
+      <w:spacing w:after="0" w:before="40"/>
       <w:outlineLvl w:val="5"/>
     </w:pPr>
     <w:rPr>
-      <w:rFonts w:asciiTheme="majorHAnsi" w:eastAsiaTheme="majorEastAsia" w:hAnsiTheme="majorHAnsi" w:cstheme="majorBidi"/>
-      <w:color w:val="4F81BD" w:themeColor="accent1"/>
-      <w:sz w:val="24"/>
-      <w:szCs w:val="24"/>
-    </w:rPr>
-  </w:style>
-  <w:style w:type="paragraph" w:styleId="Heading7">
-    <w:name w:val="Heading 7"/>
+      <w:rFonts w:cstheme="majorBidi" w:eastAsiaTheme="majorEastAsia"/>
+      <w:i/>
+      <w:iCs/>
+      <w:color w:themeColor="text1" w:themeTint="A6" w:val="595959"/>
+    </w:rPr>
+  </w:style>
+  <w:style w:styleId="Heading7" w:type="paragraph">
+    <w:name w:val="heading 7"/>
     <w:basedOn w:val="Normal"/>
     <w:next w:val="BodyText"/>
+    <w:link w:val="Heading7Char"/>
     <w:uiPriority w:val="9"/>
+    <w:semiHidden/>
     <w:unhideWhenUsed/>
     <w:qFormat/>
+    <w:rsid w:val="00A10FD9"/>
     <w:pPr>
       <w:keepNext/>
       <w:keepLines/>
-      <w:spacing w:before="200" w:after="0"/>
+      <w:spacing w:after="0" w:before="40"/>
       <w:outlineLvl w:val="6"/>
     </w:pPr>
     <w:rPr>
-      <w:rFonts w:asciiTheme="majorHAnsi" w:eastAsiaTheme="majorEastAsia" w:hAnsiTheme="majorHAnsi" w:cstheme="majorBidi"/>
-      <w:color w:val="4F81BD" w:themeColor="accent1"/>
-      <w:sz w:val="24"/>
-      <w:szCs w:val="24"/>
-    </w:rPr>
-  </w:style>
-  <w:style w:type="paragraph" w:styleId="Heading8">
-    <w:name w:val="Heading 8"/>
+      <w:rFonts w:cstheme="majorBidi" w:eastAsiaTheme="majorEastAsia"/>
+      <w:color w:themeColor="text1" w:themeTint="A6" w:val="595959"/>
+    </w:rPr>
+  </w:style>
+  <w:style w:styleId="Heading8" w:type="paragraph">
+    <w:name w:val="heading 8"/>
     <w:basedOn w:val="Normal"/>
     <w:next w:val="BodyText"/>
+    <w:link w:val="Heading8Char"/>
     <w:uiPriority w:val="9"/>
+    <w:semiHidden/>
     <w:unhideWhenUsed/>
     <w:qFormat/>
+    <w:rsid w:val="00A10FD9"/>
     <w:pPr>
       <w:keepNext/>
       <w:keepLines/>
-      <w:spacing w:before="200" w:after="0"/>
+      <w:spacing w:after="0"/>
       <w:outlineLvl w:val="7"/>
     </w:pPr>
     <w:rPr>
-      <w:rFonts w:asciiTheme="majorHAnsi" w:eastAsiaTheme="majorEastAsia" w:hAnsiTheme="majorHAnsi" w:cstheme="majorBidi"/>
-      <w:color w:val="4F81BD" w:themeColor="accent1"/>
-      <w:sz w:val="24"/>
-      <w:szCs w:val="24"/>
-    </w:rPr>
-  </w:style>
-  <w:style w:type="paragraph" w:styleId="Heading9">
-    <w:name w:val="Heading 9"/>
+      <w:rFonts w:cstheme="majorBidi" w:eastAsiaTheme="majorEastAsia"/>
+      <w:i/>
+      <w:iCs/>
+      <w:color w:themeColor="text1" w:themeTint="D8" w:val="272727"/>
+    </w:rPr>
+  </w:style>
+  <w:style w:styleId="Heading9" w:type="paragraph">
+    <w:name w:val="heading 9"/>
     <w:basedOn w:val="Normal"/>
     <w:next w:val="BodyText"/>
+    <w:link w:val="Heading9Char"/>
     <w:uiPriority w:val="9"/>
+    <w:semiHidden/>
     <w:unhideWhenUsed/>
     <w:qFormat/>
+    <w:rsid w:val="00A10FD9"/>
     <w:pPr>
       <w:keepNext/>
       <w:keepLines/>
-      <w:spacing w:before="200" w:after="0"/>
+      <w:spacing w:after="0"/>
       <w:outlineLvl w:val="8"/>
     </w:pPr>
     <w:rPr>
-      <w:rFonts w:asciiTheme="majorHAnsi" w:eastAsiaTheme="majorEastAsia" w:hAnsiTheme="majorHAnsi" w:cstheme="majorBidi"/>
-      <w:color w:val="4F81BD" w:themeColor="accent1"/>
-      <w:sz w:val="24"/>
-      <w:szCs w:val="24"/>
-    </w:rPr>
-  </w:style>
-  <w:style w:type="paragraph" w:styleId="BlockText">
+      <w:rFonts w:cstheme="majorBidi" w:eastAsiaTheme="majorEastAsia"/>
+      <w:color w:themeColor="text1" w:themeTint="D8" w:val="272727"/>
+    </w:rPr>
+  </w:style>
+  <w:style w:customStyle="1" w:styleId="Heading1Char" w:type="character">
+    <w:name w:val="Heading 1 Char"/>
+    <w:basedOn w:val="DefaultParagraphFont"/>
+    <w:link w:val="Heading1"/>
+    <w:uiPriority w:val="9"/>
+    <w:rsid w:val="00A10FD9"/>
+    <w:rPr>
+      <w:rFonts w:asciiTheme="majorHAnsi" w:cstheme="majorBidi" w:eastAsiaTheme="majorEastAsia" w:hAnsiTheme="majorHAnsi"/>
+      <w:color w:themeColor="accent1" w:themeShade="BF" w:val="0F4761"/>
+      <w:sz w:val="40"/>
+      <w:szCs w:val="40"/>
+    </w:rPr>
+  </w:style>
+  <w:style w:customStyle="1" w:styleId="Heading2Char" w:type="character">
+    <w:name w:val="Heading 2 Char"/>
+    <w:basedOn w:val="DefaultParagraphFont"/>
+    <w:link w:val="Heading2"/>
+    <w:uiPriority w:val="9"/>
+    <w:semiHidden/>
+    <w:rsid w:val="00A10FD9"/>
+    <w:rPr>
+      <w:rFonts w:asciiTheme="majorHAnsi" w:cstheme="majorBidi" w:eastAsiaTheme="majorEastAsia" w:hAnsiTheme="majorHAnsi"/>
+      <w:color w:themeColor="accent1" w:themeShade="BF" w:val="0F4761"/>
+      <w:sz w:val="32"/>
+      <w:szCs w:val="32"/>
+    </w:rPr>
+  </w:style>
+  <w:style w:customStyle="1" w:styleId="Heading3Char" w:type="character">
+    <w:name w:val="Heading 3 Char"/>
+    <w:basedOn w:val="DefaultParagraphFont"/>
+    <w:link w:val="Heading3"/>
+    <w:uiPriority w:val="9"/>
+    <w:semiHidden/>
+    <w:rsid w:val="00A10FD9"/>
+    <w:rPr>
+      <w:rFonts w:cstheme="majorBidi" w:eastAsiaTheme="majorEastAsia"/>
+      <w:color w:themeColor="accent1" w:themeShade="BF" w:val="0F4761"/>
+      <w:sz w:val="28"/>
+      <w:szCs w:val="28"/>
+    </w:rPr>
+  </w:style>
+  <w:style w:customStyle="1" w:styleId="Heading4Char" w:type="character">
+    <w:name w:val="Heading 4 Char"/>
+    <w:basedOn w:val="DefaultParagraphFont"/>
+    <w:link w:val="Heading4"/>
+    <w:uiPriority w:val="9"/>
+    <w:semiHidden/>
+    <w:rsid w:val="00A10FD9"/>
+    <w:rPr>
+      <w:rFonts w:cstheme="majorBidi" w:eastAsiaTheme="majorEastAsia"/>
+      <w:i/>
+      <w:iCs/>
+      <w:color w:themeColor="accent1" w:themeShade="BF" w:val="0F4761"/>
+    </w:rPr>
+  </w:style>
+  <w:style w:customStyle="1" w:styleId="Heading5Char" w:type="character">
+    <w:name w:val="Heading 5 Char"/>
+    <w:basedOn w:val="DefaultParagraphFont"/>
+    <w:link w:val="Heading5"/>
+    <w:uiPriority w:val="9"/>
+    <w:semiHidden/>
+    <w:rsid w:val="00A10FD9"/>
+    <w:rPr>
+      <w:rFonts w:cstheme="majorBidi" w:eastAsiaTheme="majorEastAsia"/>
+      <w:color w:themeColor="accent1" w:themeShade="BF" w:val="0F4761"/>
+    </w:rPr>
+  </w:style>
+  <w:style w:customStyle="1" w:styleId="Heading6Char" w:type="character">
+    <w:name w:val="Heading 6 Char"/>
+    <w:basedOn w:val="DefaultParagraphFont"/>
+    <w:link w:val="Heading6"/>
+    <w:uiPriority w:val="9"/>
+    <w:semiHidden/>
+    <w:rsid w:val="00A10FD9"/>
+    <w:rPr>
+      <w:rFonts w:cstheme="majorBidi" w:eastAsiaTheme="majorEastAsia"/>
+      <w:i/>
+      <w:iCs/>
+      <w:color w:themeColor="text1" w:themeTint="A6" w:val="595959"/>
+    </w:rPr>
+  </w:style>
+  <w:style w:customStyle="1" w:styleId="Heading7Char" w:type="character">
+    <w:name w:val="Heading 7 Char"/>
+    <w:basedOn w:val="DefaultParagraphFont"/>
+    <w:link w:val="Heading7"/>
+    <w:uiPriority w:val="9"/>
+    <w:semiHidden/>
+    <w:rsid w:val="00A10FD9"/>
+    <w:rPr>
+      <w:rFonts w:cstheme="majorBidi" w:eastAsiaTheme="majorEastAsia"/>
+      <w:color w:themeColor="text1" w:themeTint="A6" w:val="595959"/>
+    </w:rPr>
+  </w:style>
+  <w:style w:customStyle="1" w:styleId="Heading8Char" w:type="character">
+    <w:name w:val="Heading 8 Char"/>
+    <w:basedOn w:val="DefaultParagraphFont"/>
+    <w:link w:val="Heading8"/>
+    <w:uiPriority w:val="9"/>
+    <w:semiHidden/>
+    <w:rsid w:val="00A10FD9"/>
+    <w:rPr>
+      <w:rFonts w:cstheme="majorBidi" w:eastAsiaTheme="majorEastAsia"/>
+      <w:i/>
+      <w:iCs/>
+      <w:color w:themeColor="text1" w:themeTint="D8" w:val="272727"/>
+    </w:rPr>
+  </w:style>
+  <w:style w:customStyle="1" w:styleId="Heading9Char" w:type="character">
+    <w:name w:val="Heading 9 Char"/>
+    <w:basedOn w:val="DefaultParagraphFont"/>
+    <w:link w:val="Heading9"/>
+    <w:uiPriority w:val="9"/>
+    <w:semiHidden/>
+    <w:rsid w:val="00A10FD9"/>
+    <w:rPr>
+      <w:rFonts w:cstheme="majorBidi" w:eastAsiaTheme="majorEastAsia"/>
+      <w:color w:themeColor="text1" w:themeTint="D8" w:val="272727"/>
+    </w:rPr>
+  </w:style>
+  <w:style w:styleId="BlockText" w:type="paragraph">
     <w:name w:val="Block Text"/>
     <w:basedOn w:val="BodyText"/>
     <w:next w:val="BodyText"/>
@@ -2060,11 +2406,11 @@
     <w:unhideWhenUsed/>
     <w:qFormat/>
     <w:pPr>
-      <w:spacing w:before="100" w:after="100"/>
+      <w:spacing w:after="100" w:before="100"/>
       <w:ind w:firstLine="0" w:left="480" w:right="480"/>
     </w:pPr>
   </w:style>
-  <w:style w:type="paragraph" w:styleId="FootnoteText">
+  <w:style w:styleId="FootnoteText" w:type="paragraph">
     <w:name w:val="Footnote Text"/>
     <w:basedOn w:val="Normal"/>
     <w:next w:val="FootnoteText"/>
@@ -2072,28 +2418,48 @@
     <w:unhideWhenUsed/>
     <w:qFormat/>
   </w:style>
-  <w:style w:type="character" w:default="1" w:styleId="DefaultParagraphFont">
+  <w:style w:styleId="FootnoteBlockText" w:type="paragraph">
+    <w:name w:val="Footnote Block Text"/>
+    <w:basedOn w:val="FootnoteText"/>
+    <w:next w:val="FootnoteText"/>
+    <w:uiPriority w:val="9"/>
+    <w:unhideWhenUsed/>
+    <w:qFormat/>
+    <w:pPr>
+      <w:spacing w:after="100" w:before="100"/>
+      <w:ind w:firstLine="0" w:left="480" w:right="480"/>
+    </w:pPr>
+  </w:style>
+  <w:style w:default="1" w:styleId="DefaultParagraphFont" w:type="character">
     <w:name w:val="Default Paragraph Font"/>
     <w:semiHidden/>
     <w:unhideWhenUsed/>
   </w:style>
-  <w:style w:type="table" w:default="1" w:styleId="Table">
+  <w:style w:default="1" w:styleId="Table" w:type="table">
     <w:name w:val="Table"/>
     <w:basedOn w:val="TableNormal"/>
     <w:semiHidden/>
     <w:unhideWhenUsed/>
     <w:qFormat/>
     <w:tblPr>
-      <w:tblInd w:w="0" w:type="dxa"/>
+      <w:tblInd w:type="dxa" w:w="0"/>
       <w:tblCellMar>
-        <w:top w:w="0" w:type="dxa"/>
-        <w:left w:w="108" w:type="dxa"/>
-        <w:bottom w:w="0" w:type="dxa"/>
-        <w:right w:w="108" w:type="dxa"/>
+        <w:top w:type="dxa" w:w="0"/>
+        <w:left w:type="dxa" w:w="108"/>
+        <w:bottom w:type="dxa" w:w="0"/>
+        <w:right w:type="dxa" w:w="108"/>
       </w:tblCellMar>
     </w:tblPr>
-  </w:style>
-  <w:style w:type="paragraph" w:customStyle="1" w:styleId="DefinitionTerm">
+    <w:tblStylePr w:type="firstRow">
+      <w:tcPr>
+        <w:tcBorders>
+          <w:bottom w:val="single"/>
+        </w:tcBorders>
+        <w:vAlign w:val="bottom"/>
+      </w:tcPr>
+    </w:tblStylePr>
+  </w:style>
+  <w:style w:customStyle="1" w:styleId="DefinitionTerm" w:type="paragraph">
     <w:name w:val="Definition Term"/>
     <w:basedOn w:val="Normal"/>
     <w:next w:val="Definition"/>
@@ -2106,49 +2472,49 @@
       <w:b/>
     </w:rPr>
   </w:style>
-  <w:style w:type="paragraph" w:customStyle="1" w:styleId="Definition">
+  <w:style w:customStyle="1" w:styleId="Definition" w:type="paragraph">
     <w:name w:val="Definition"/>
     <w:basedOn w:val="Normal"/>
   </w:style>
-  <w:style w:type="paragraph" w:styleId="Caption">
+  <w:style w:styleId="Caption" w:type="paragraph">
     <w:name w:val="Caption"/>
     <w:basedOn w:val="Normal"/>
     <w:link w:val="BodyTextChar"/>
     <w:pPr>
-      <w:spacing w:before="0" w:after="120"/>
+      <w:spacing w:after="120" w:before="0"/>
     </w:pPr>
     <w:rPr>
       <w:i/>
     </w:rPr>
   </w:style>
-  <w:style w:type="paragraph" w:customStyle="1" w:styleId="TableCaption">
+  <w:style w:customStyle="1" w:styleId="TableCaption" w:type="paragraph">
     <w:name w:val="Table Caption"/>
     <w:basedOn w:val="Caption"/>
     <w:pPr>
       <w:keepNext/>
     </w:pPr>
   </w:style>
-  <w:style w:type="paragraph" w:customStyle="1" w:styleId="ImageCaption">
+  <w:style w:customStyle="1" w:styleId="ImageCaption" w:type="paragraph">
     <w:name w:val="Image Caption"/>
     <w:basedOn w:val="Caption"/>
   </w:style>
-  <w:style w:type="paragraph" w:customStyle="1" w:styleId="Figure">
+  <w:style w:customStyle="1" w:styleId="Figure" w:type="paragraph">
     <w:name w:val="Figure"/>
     <w:basedOn w:val="Normal"/>
   </w:style>
-  <w:style w:type="paragraph" w:customStyle="1" w:styleId="CaptionedFigure">
+  <w:style w:customStyle="1" w:styleId="CaptionedFigure" w:type="paragraph">
     <w:name w:val="Captioned Figure"/>
     <w:basedOn w:val="Figure"/>
     <w:pPr>
       <w:keepNext/>
     </w:pPr>
   </w:style>
-  <w:style w:type="character" w:customStyle="1" w:styleId="BodyTextChar">
+  <w:style w:customStyle="1" w:styleId="BodyTextChar" w:type="character">
     <w:name w:val="Body Text Char"/>
     <w:basedOn w:val="DefaultParagraphFont"/>
     <w:link w:val="BodyText"/>
   </w:style>
-  <w:style w:type="character" w:customStyle="1" w:styleId="VerbatimChar">
+  <w:style w:customStyle="1" w:styleId="VerbatimChar" w:type="character">
     <w:name w:val="Verbatim Char"/>
     <w:basedOn w:val="BodyTextChar"/>
     <w:rPr>
@@ -2156,21 +2522,25 @@
       <w:sz w:val="22"/>
     </w:rPr>
   </w:style>
-  <w:style w:type="character" w:styleId="FootnoteReference">
+  <w:style w:customStyle="1" w:styleId="SectionNumber" w:type="character">
+    <w:name w:val="Section Number"/>
+    <w:basedOn w:val="BodyTextChar"/>
+  </w:style>
+  <w:style w:styleId="FootnoteReference" w:type="character">
     <w:name w:val="Footnote Reference"/>
     <w:basedOn w:val="BodyTextChar"/>
     <w:rPr>
       <w:vertAlign w:val="superscript"/>
     </w:rPr>
   </w:style>
-  <w:style w:type="character" w:styleId="Hyperlink">
+  <w:style w:styleId="Hyperlink" w:type="character">
     <w:name w:val="Hyperlink"/>
     <w:basedOn w:val="BodyTextChar"/>
     <w:rPr>
-      <w:color w:val="4F81BD" w:themeColor="accent1"/>
-    </w:rPr>
-  </w:style>
-  <w:style w:type="paragraph" w:styleId="TOCHeading">
+      <w:color w:themeColor="accent1" w:val="4F81BD"/>
+    </w:rPr>
+  </w:style>
+  <w:style w:styleId="TOCHeading" w:type="paragraph">
     <w:name w:val="TOC Heading"/>
     <w:basedOn w:val="Heading1"/>
     <w:next w:val="BodyText"/>
@@ -2182,10 +2552,10 @@
       <w:outlineLvl w:val="9"/>
     </w:pPr>
     <w:rPr>
-      <w:rFonts w:asciiTheme="majorHAnsi" w:eastAsiaTheme="majorEastAsia" w:hAnsiTheme="majorHAnsi" w:cstheme="majorBidi"/>
+      <w:rFonts w:asciiTheme="majorHAnsi" w:cstheme="majorBidi" w:eastAsiaTheme="majorEastAsia" w:hAnsiTheme="majorHAnsi"/>
       <w:b w:val="0"/>
       <w:bCs w:val="0"/>
-      <w:color w:val="365F91" w:themeColor="accent1" w:themeShade="BF"/>
+      <w:color w:themeColor="accent1" w:themeShade="BF" w:val="365F91"/>
     </w:rPr>
   </w:style>
   <w:style w:type="paragraph" w:customStyle="1" w:styleId="SourceCode">
@@ -2200,8 +2570,8 @@
     <w:name w:val="KeywordTok"/>
     <w:basedOn w:val="VerbatimChar"/>
     <w:rPr>
+      <w:b/>
       <w:color w:val="007020"/>
-      <w:b/>
     </w:rPr>
   </w:style>
   <w:style w:type="character" w:customStyle="1" w:styleId="DataTypeTok">
@@ -2277,40 +2647,43 @@
   <w:style w:type="character" w:customStyle="1" w:styleId="ImportTok">
     <w:name w:val="ImportTok"/>
     <w:basedOn w:val="VerbatimChar"/>
-    <w:rPr/>
+    <w:rPr>
+      <w:b/>
+      <w:color w:val="008000"/>
+    </w:rPr>
   </w:style>
   <w:style w:type="character" w:customStyle="1" w:styleId="CommentTok">
     <w:name w:val="CommentTok"/>
     <w:basedOn w:val="VerbatimChar"/>
     <w:rPr>
+      <w:i/>
       <w:color w:val="60a0b0"/>
-      <w:i/>
     </w:rPr>
   </w:style>
   <w:style w:type="character" w:customStyle="1" w:styleId="DocumentationTok">
     <w:name w:val="DocumentationTok"/>
     <w:basedOn w:val="VerbatimChar"/>
     <w:rPr>
+      <w:i/>
       <w:color w:val="ba2121"/>
-      <w:i/>
     </w:rPr>
   </w:style>
   <w:style w:type="character" w:customStyle="1" w:styleId="AnnotationTok">
     <w:name w:val="AnnotationTok"/>
     <w:basedOn w:val="VerbatimChar"/>
     <w:rPr>
-      <w:color w:val="60a0b0"/>
       <w:b/>
       <w:i/>
+      <w:color w:val="60a0b0"/>
     </w:rPr>
   </w:style>
   <w:style w:type="character" w:customStyle="1" w:styleId="CommentVarTok">
     <w:name w:val="CommentVarTok"/>
     <w:basedOn w:val="VerbatimChar"/>
     <w:rPr>
-      <w:color w:val="60a0b0"/>
       <w:b/>
       <w:i/>
+      <w:color w:val="60a0b0"/>
     </w:rPr>
   </w:style>
   <w:style w:type="character" w:customStyle="1" w:styleId="OtherTok">
@@ -2338,8 +2711,8 @@
     <w:name w:val="ControlFlowTok"/>
     <w:basedOn w:val="VerbatimChar"/>
     <w:rPr>
+      <w:b/>
       <w:color w:val="007020"/>
-      <w:b/>
     </w:rPr>
   </w:style>
   <w:style w:type="character" w:customStyle="1" w:styleId="OperatorTok">
@@ -2352,7 +2725,9 @@
   <w:style w:type="character" w:customStyle="1" w:styleId="BuiltInTok">
     <w:name w:val="BuiltInTok"/>
     <w:basedOn w:val="VerbatimChar"/>
-    <w:rPr/>
+    <w:rPr>
+      <w:color w:val="008000"/>
+    </w:rPr>
   </w:style>
   <w:style w:type="character" w:customStyle="1" w:styleId="ExtensionTok">
     <w:name w:val="ExtensionTok"/>
@@ -2382,34 +2757,34 @@
     <w:name w:val="InformationTok"/>
     <w:basedOn w:val="VerbatimChar"/>
     <w:rPr>
-      <w:color w:val="60a0b0"/>
       <w:b/>
       <w:i/>
+      <w:color w:val="60a0b0"/>
     </w:rPr>
   </w:style>
   <w:style w:type="character" w:customStyle="1" w:styleId="WarningTok">
     <w:name w:val="WarningTok"/>
     <w:basedOn w:val="VerbatimChar"/>
     <w:rPr>
-      <w:color w:val="60a0b0"/>
       <w:b/>
       <w:i/>
+      <w:color w:val="60a0b0"/>
     </w:rPr>
   </w:style>
   <w:style w:type="character" w:customStyle="1" w:styleId="AlertTok">
     <w:name w:val="AlertTok"/>
     <w:basedOn w:val="VerbatimChar"/>
     <w:rPr>
+      <w:b/>
       <w:color w:val="ff0000"/>
-      <w:b/>
     </w:rPr>
   </w:style>
   <w:style w:type="character" w:customStyle="1" w:styleId="ErrorTok">
     <w:name w:val="ErrorTok"/>
     <w:basedOn w:val="VerbatimChar"/>
     <w:rPr>
+      <w:b/>
       <w:color w:val="ff0000"/>
-      <w:b/>
     </w:rPr>
   </w:style>
   <w:style w:type="character" w:customStyle="1" w:styleId="NormalTok">
@@ -2431,44 +2806,44 @@
         <a:sysClr val="window" lastClr="FFFFFF"/>
       </a:lt1>
       <a:dk2>
-        <a:srgbClr val="1F497D"/>
+        <a:srgbClr val="0E2841"/>
       </a:dk2>
       <a:lt2>
-        <a:srgbClr val="EEECE1"/>
+        <a:srgbClr val="E8E8E8"/>
       </a:lt2>
       <a:accent1>
-        <a:srgbClr val="4F81BD"/>
+        <a:srgbClr val="156082"/>
       </a:accent1>
       <a:accent2>
-        <a:srgbClr val="C0504D"/>
+        <a:srgbClr val="E97132"/>
       </a:accent2>
       <a:accent3>
-        <a:srgbClr val="9BBB59"/>
+        <a:srgbClr val="196B24"/>
       </a:accent3>
       <a:accent4>
-        <a:srgbClr val="8064A2"/>
+        <a:srgbClr val="0F9ED5"/>
       </a:accent4>
       <a:accent5>
-        <a:srgbClr val="4BACC6"/>
+        <a:srgbClr val="A02B93"/>
       </a:accent5>
       <a:accent6>
-        <a:srgbClr val="F79646"/>
+        <a:srgbClr val="4EA72E"/>
       </a:accent6>
       <a:hlink>
-        <a:srgbClr val="0000FF"/>
+        <a:srgbClr val="467886"/>
       </a:hlink>
       <a:folHlink>
-        <a:srgbClr val="800080"/>
+        <a:srgbClr val="96607D"/>
       </a:folHlink>
     </a:clrScheme>
     <a:fontScheme name="Office">
       <a:majorFont>
-        <a:latin typeface="Calibri"/>
+        <a:latin typeface="Aptos Display" panose="02110004020202020204"/>
         <a:ea typeface=""/>
         <a:cs typeface=""/>
-        <a:font script="Jpan" typeface="ＭＳ ゴシック"/>
+        <a:font script="Jpan" typeface="游ゴシック Light"/>
         <a:font script="Hang" typeface="맑은 고딕"/>
-        <a:font script="Hans" typeface="宋体"/>
+        <a:font script="Hans" typeface="等线 Light"/>
         <a:font script="Hant" typeface="新細明體"/>
         <a:font script="Arab" typeface="Times New Roman"/>
         <a:font script="Hebr" typeface="Times New Roman"/>
@@ -2495,14 +2870,32 @@
         <a:font script="Mong" typeface="Mongolian Baiti"/>
         <a:font script="Viet" typeface="Times New Roman"/>
         <a:font script="Uigh" typeface="Microsoft Uighur"/>
+        <a:font script="Geor" typeface="Sylfaen"/>
+        <a:font script="Armn" typeface="Arial"/>
+        <a:font script="Bugi" typeface="Leelawadee UI"/>
+        <a:font script="Bopo" typeface="Microsoft JhengHei"/>
+        <a:font script="Java" typeface="Javanese Text"/>
+        <a:font script="Lisu" typeface="Segoe UI"/>
+        <a:font script="Mymr" typeface="Myanmar Text"/>
+        <a:font script="Nkoo" typeface="Ebrima"/>
+        <a:font script="Olck" typeface="Nirmala UI"/>
+        <a:font script="Osma" typeface="Ebrima"/>
+        <a:font script="Phag" typeface="Phagspa"/>
+        <a:font script="Syrn" typeface="Estrangelo Edessa"/>
+        <a:font script="Syrj" typeface="Estrangelo Edessa"/>
+        <a:font script="Syre" typeface="Estrangelo Edessa"/>
+        <a:font script="Sora" typeface="Nirmala UI"/>
+        <a:font script="Tale" typeface="Microsoft Tai Le"/>
+        <a:font script="Talu" typeface="Microsoft New Tai Lue"/>
+        <a:font script="Tfng" typeface="Ebrima"/>
       </a:majorFont>
       <a:minorFont>
-        <a:latin typeface="Cambria"/>
+        <a:latin typeface="Aptos" panose="02110004020202020204"/>
         <a:ea typeface=""/>
         <a:cs typeface=""/>
-        <a:font script="Jpan" typeface="ＭＳ 明朝"/>
+        <a:font script="Jpan" typeface="游明朝"/>
         <a:font script="Hang" typeface="맑은 고딕"/>
-        <a:font script="Hans" typeface="宋体"/>
+        <a:font script="Hans" typeface="等线"/>
         <a:font script="Hant" typeface="新細明體"/>
         <a:font script="Arab" typeface="Arial"/>
         <a:font script="Hebr" typeface="Arial"/>
@@ -2529,6 +2922,24 @@
         <a:font script="Mong" typeface="Mongolian Baiti"/>
         <a:font script="Viet" typeface="Arial"/>
         <a:font script="Uigh" typeface="Microsoft Uighur"/>
+        <a:font script="Geor" typeface="Sylfaen"/>
+        <a:font script="Armn" typeface="Arial"/>
+        <a:font script="Bugi" typeface="Leelawadee UI"/>
+        <a:font script="Bopo" typeface="Microsoft JhengHei"/>
+        <a:font script="Java" typeface="Javanese Text"/>
+        <a:font script="Lisu" typeface="Segoe UI"/>
+        <a:font script="Mymr" typeface="Myanmar Text"/>
+        <a:font script="Nkoo" typeface="Ebrima"/>
+        <a:font script="Olck" typeface="Nirmala UI"/>
+        <a:font script="Osma" typeface="Ebrima"/>
+        <a:font script="Phag" typeface="Phagspa"/>
+        <a:font script="Syrn" typeface="Estrangelo Edessa"/>
+        <a:font script="Syrj" typeface="Estrangelo Edessa"/>
+        <a:font script="Syre" typeface="Estrangelo Edessa"/>
+        <a:font script="Sora" typeface="Nirmala UI"/>
+        <a:font script="Tale" typeface="Microsoft Tai Le"/>
+        <a:font script="Talu" typeface="Microsoft New Tai Lue"/>
+        <a:font script="Tfng" typeface="Ebrima"/>
       </a:minorFont>
     </a:fontScheme>
     <a:fmtScheme name="Office">
@@ -2540,200 +2951,141 @@
           <a:gsLst>
             <a:gs pos="0">
               <a:schemeClr val="phClr">
-                <a:tint val="50000"/>
-                <a:satMod val="300000"/>
+                <a:lumMod val="110000"/>
+                <a:satMod val="105000"/>
+                <a:tint val="67000"/>
               </a:schemeClr>
             </a:gs>
-            <a:gs pos="35000">
+            <a:gs pos="50000">
               <a:schemeClr val="phClr">
-                <a:tint val="37000"/>
-                <a:satMod val="300000"/>
+                <a:lumMod val="105000"/>
+                <a:satMod val="103000"/>
+                <a:tint val="73000"/>
               </a:schemeClr>
             </a:gs>
             <a:gs pos="100000">
               <a:schemeClr val="phClr">
-                <a:tint val="15000"/>
-                <a:satMod val="350000"/>
+                <a:lumMod val="105000"/>
+                <a:satMod val="109000"/>
+                <a:tint val="81000"/>
               </a:schemeClr>
             </a:gs>
           </a:gsLst>
-          <a:lin ang="16200000" scaled="1"/>
+          <a:lin ang="5400000" scaled="0"/>
         </a:gradFill>
         <a:gradFill rotWithShape="1">
           <a:gsLst>
             <a:gs pos="0">
               <a:schemeClr val="phClr">
-                <a:tint val="100000"/>
+                <a:satMod val="103000"/>
+                <a:lumMod val="102000"/>
+                <a:tint val="94000"/>
+              </a:schemeClr>
+            </a:gs>
+            <a:gs pos="50000">
+              <a:schemeClr val="phClr">
+                <a:satMod val="110000"/>
+                <a:lumMod val="100000"/>
                 <a:shade val="100000"/>
-                <a:satMod val="130000"/>
               </a:schemeClr>
             </a:gs>
             <a:gs pos="100000">
               <a:schemeClr val="phClr">
-                <a:tint val="50000"/>
-                <a:shade val="100000"/>
-                <a:satMod val="350000"/>
+                <a:lumMod val="99000"/>
+                <a:satMod val="120000"/>
+                <a:shade val="78000"/>
               </a:schemeClr>
             </a:gs>
           </a:gsLst>
-          <a:lin ang="16200000" scaled="0"/>
+          <a:lin ang="5400000" scaled="0"/>
         </a:gradFill>
       </a:fillStyleLst>
       <a:lnStyleLst>
-        <a:ln w="9525" cap="flat" cmpd="sng" algn="ctr">
-          <a:solidFill>
-            <a:schemeClr val="phClr">
-              <a:shade val="95000"/>
-              <a:satMod val="105000"/>
-            </a:schemeClr>
-          </a:solidFill>
-          <a:prstDash val="solid"/>
-        </a:ln>
-        <a:ln w="25400" cap="flat" cmpd="sng" algn="ctr">
+        <a:ln w="6350" cap="flat" cmpd="sng" algn="ctr">
           <a:solidFill>
             <a:schemeClr val="phClr"/>
           </a:solidFill>
           <a:prstDash val="solid"/>
+          <a:miter lim="800000"/>
         </a:ln>
-        <a:ln w="38100" cap="flat" cmpd="sng" algn="ctr">
+        <a:ln w="12700" cap="flat" cmpd="sng" algn="ctr">
           <a:solidFill>
             <a:schemeClr val="phClr"/>
           </a:solidFill>
           <a:prstDash val="solid"/>
+          <a:miter lim="800000"/>
+        </a:ln>
+        <a:ln w="19050" cap="flat" cmpd="sng" algn="ctr">
+          <a:solidFill>
+            <a:schemeClr val="phClr"/>
+          </a:solidFill>
+          <a:prstDash val="solid"/>
+          <a:miter lim="800000"/>
         </a:ln>
       </a:lnStyleLst>
       <a:effectStyleLst>
         <a:effectStyle>
+          <a:effectLst/>
+        </a:effectStyle>
+        <a:effectStyle>
+          <a:effectLst/>
+        </a:effectStyle>
+        <a:effectStyle>
           <a:effectLst>
-            <a:outerShdw blurRad="40000" dist="20000" dir="5400000" rotWithShape="0">
+            <a:outerShdw blurRad="57150" dist="19050" dir="5400000" algn="ctr" rotWithShape="0">
               <a:srgbClr val="000000">
-                <a:alpha val="38000"/>
+                <a:alpha val="63000"/>
               </a:srgbClr>
             </a:outerShdw>
           </a:effectLst>
-        </a:effectStyle>
-        <a:effectStyle>
-          <a:effectLst>
-            <a:outerShdw blurRad="40000" dist="23000" dir="5400000" rotWithShape="0">
-              <a:srgbClr val="000000">
-                <a:alpha val="35000"/>
-              </a:srgbClr>
-            </a:outerShdw>
-          </a:effectLst>
-        </a:effectStyle>
-        <a:effectStyle>
-          <a:effectLst>
-            <a:outerShdw blurRad="40000" dist="23000" dir="5400000" rotWithShape="0">
-              <a:srgbClr val="000000">
-                <a:alpha val="35000"/>
-              </a:srgbClr>
-            </a:outerShdw>
-          </a:effectLst>
-          <a:scene3d>
-            <a:camera prst="orthographicFront">
-              <a:rot lat="0" lon="0" rev="0"/>
-            </a:camera>
-            <a:lightRig rig="threePt" dir="t">
-              <a:rot lat="0" lon="0" rev="1200000"/>
-            </a:lightRig>
-          </a:scene3d>
-          <a:sp3d>
-            <a:bevelT w="63500" h="25400"/>
-          </a:sp3d>
         </a:effectStyle>
       </a:effectStyleLst>
       <a:bgFillStyleLst>
         <a:solidFill>
           <a:schemeClr val="phClr"/>
         </a:solidFill>
+        <a:solidFill>
+          <a:schemeClr val="phClr">
+            <a:tint val="95000"/>
+            <a:satMod val="170000"/>
+          </a:schemeClr>
+        </a:solidFill>
         <a:gradFill rotWithShape="1">
           <a:gsLst>
             <a:gs pos="0">
               <a:schemeClr val="phClr">
-                <a:tint val="40000"/>
-                <a:satMod val="350000"/>
+                <a:tint val="93000"/>
+                <a:satMod val="150000"/>
+                <a:shade val="98000"/>
+                <a:lumMod val="102000"/>
               </a:schemeClr>
             </a:gs>
-            <a:gs pos="40000">
+            <a:gs pos="50000">
               <a:schemeClr val="phClr">
-                <a:tint val="45000"/>
-                <a:shade val="99000"/>
-                <a:satMod val="350000"/>
+                <a:tint val="98000"/>
+                <a:satMod val="130000"/>
+                <a:shade val="90000"/>
+                <a:lumMod val="103000"/>
               </a:schemeClr>
             </a:gs>
             <a:gs pos="100000">
               <a:schemeClr val="phClr">
-                <a:shade val="20000"/>
-                <a:satMod val="255000"/>
+                <a:shade val="63000"/>
+                <a:satMod val="120000"/>
               </a:schemeClr>
             </a:gs>
           </a:gsLst>
-          <a:path path="circle">
-            <a:fillToRect l="50000" t="-80000" r="50000" b="180000"/>
-          </a:path>
-        </a:gradFill>
-        <a:gradFill rotWithShape="1">
-          <a:gsLst>
-            <a:gs pos="0">
-              <a:schemeClr val="phClr">
-                <a:tint val="80000"/>
-                <a:satMod val="300000"/>
-              </a:schemeClr>
-            </a:gs>
-            <a:gs pos="100000">
-              <a:schemeClr val="phClr">
-                <a:shade val="30000"/>
-                <a:satMod val="200000"/>
-              </a:schemeClr>
-            </a:gs>
-          </a:gsLst>
-          <a:path path="circle">
-            <a:fillToRect l="50000" t="50000" r="50000" b="50000"/>
-          </a:path>
+          <a:lin ang="5400000" scaled="0"/>
         </a:gradFill>
       </a:bgFillStyleLst>
     </a:fmtScheme>
   </a:themeElements>
-  <a:objectDefaults>
-    <a:spDef>
-      <a:spPr/>
-      <a:bodyPr/>
-      <a:lstStyle/>
-      <a:style>
-        <a:lnRef idx="1">
-          <a:schemeClr val="accent1"/>
-        </a:lnRef>
-        <a:fillRef idx="3">
-          <a:schemeClr val="accent1"/>
-        </a:fillRef>
-        <a:effectRef idx="2">
-          <a:schemeClr val="accent1"/>
-        </a:effectRef>
-        <a:fontRef idx="minor">
-          <a:schemeClr val="lt1"/>
-        </a:fontRef>
-      </a:style>
-    </a:spDef>
-    <a:lnDef>
-      <a:spPr/>
-      <a:bodyPr/>
-      <a:lstStyle/>
-      <a:style>
-        <a:lnRef idx="2">
-          <a:schemeClr val="accent1"/>
-        </a:lnRef>
-        <a:fillRef idx="0">
-          <a:schemeClr val="accent1"/>
-        </a:fillRef>
-        <a:effectRef idx="1">
-          <a:schemeClr val="accent1"/>
-        </a:effectRef>
-        <a:fontRef idx="minor">
-          <a:schemeClr val="tx1"/>
-        </a:fontRef>
-      </a:style>
-    </a:lnDef>
-  </a:objectDefaults>
+  <a:objectDefaults/>
   <a:extraClrSchemeLst/>
+  <a:extLst>
+    <a:ext uri="{05A4C25C-085E-4340-85A3-A5531E510DB2}">
+      <thm15:themeFamily xmlns:thm15="http://schemas.microsoft.com/office/thememl/2012/main" name="Office Theme" id="{2E142A2C-CD16-42D6-873A-C26D2A0506FA}" vid="{1BDDFF52-6CD6-40A5-AB3C-68EB2F1E4D0A}"/>
+    </a:ext>
+  </a:extLst>
 </a:theme>
 </file>
</xml_diff>

<commit_message>
Adiciona versão do currículo em pt-BR
Cria README.pt-BR.md como tradução completa do currículo em inglês,
com link de idioma entre os dois READMEs, e atualiza convert.sh para
gerar docx/pdf em ambas as línguas.

Co-Authored-By: Claude Sonnet 5 <noreply@anthropic.com>
Claude-Session: https://claude.ai/code/session_01Bc8pNf8Rs261W76DZkmHy4
</commit_message>
<xml_diff>
--- a/Roberto Albino Junior.docx
+++ b/Roberto Albino Junior.docx
@@ -2,7 +2,7 @@
 <file path=word/document.xml><?xml version="1.0" encoding="utf-8"?>
 <w:document xmlns:w="http://schemas.openxmlformats.org/wordprocessingml/2006/main" xmlns:m="http://schemas.openxmlformats.org/officeDocument/2006/math" xmlns:r="http://schemas.openxmlformats.org/officeDocument/2006/relationships" xmlns:o="urn:schemas-microsoft-com:office:office" xmlns:v="urn:schemas-microsoft-com:vml" xmlns:w10="urn:schemas-microsoft-com:office:word" xmlns:a="http://schemas.openxmlformats.org/drawingml/2006/main" xmlns:pic="http://schemas.openxmlformats.org/drawingml/2006/picture" xmlns:wp="http://schemas.openxmlformats.org/drawingml/2006/wordprocessingDrawing">
   <w:body>
-    <w:bookmarkStart w:id="32" w:name="roberto-albino-junior"/>
+    <w:bookmarkStart w:id="33" w:name="roberto-albino-junior"/>
     <w:p>
       <w:pPr>
         <w:pStyle w:val="Heading1"/>
@@ -14,6 +14,21 @@
     <w:p>
       <w:pPr>
         <w:pStyle w:val="FirstParagraph"/>
+      </w:pPr>
+      <w:hyperlink r:id="rId9">
+        <w:r>
+          <w:rPr>
+            <w:rStyle w:val="Hyperlink"/>
+            <w:i/>
+            <w:iCs/>
+          </w:rPr>
+          <w:t xml:space="preserve">Português (PT-BR)</w:t>
+        </w:r>
+      </w:hyperlink>
+    </w:p>
+    <w:p>
+      <w:pPr>
+        <w:pStyle w:val="BodyText"/>
       </w:pPr>
       <w:r>
         <w:rPr>
@@ -91,7 +106,7 @@
       <w:r>
         <w:t xml:space="preserve"> </w:t>
       </w:r>
-      <w:hyperlink r:id="rId9">
+      <w:hyperlink r:id="rId10">
         <w:r>
           <w:rPr>
             <w:rStyle w:val="Hyperlink"/>
@@ -118,7 +133,7 @@
       <w:r>
         <w:t xml:space="preserve"> </w:t>
       </w:r>
-      <w:hyperlink r:id="rId10">
+      <w:hyperlink r:id="rId11">
         <w:r>
           <w:rPr>
             <w:rStyle w:val="Hyperlink"/>
@@ -145,7 +160,7 @@
       <w:r>
         <w:t xml:space="preserve"> </w:t>
       </w:r>
-      <w:hyperlink r:id="rId11">
+      <w:hyperlink r:id="rId12">
         <w:r>
           <w:rPr>
             <w:rStyle w:val="Hyperlink"/>
@@ -154,7 +169,7 @@
         </w:r>
       </w:hyperlink>
     </w:p>
-    <w:bookmarkStart w:id="12" w:name="professional-summary"/>
+    <w:bookmarkStart w:id="13" w:name="professional-summary"/>
     <w:p>
       <w:pPr>
         <w:pStyle w:val="Heading2"/>
@@ -297,8 +312,8 @@
         <w:t xml:space="preserve">I actively design systems considering scalability, resilience, and maintainability.</w:t>
       </w:r>
     </w:p>
-    <w:bookmarkEnd w:id="12"/>
-    <w:bookmarkStart w:id="18" w:name="core-competencies"/>
+    <w:bookmarkEnd w:id="13"/>
+    <w:bookmarkStart w:id="19" w:name="core-competencies"/>
     <w:p>
       <w:pPr>
         <w:pStyle w:val="Heading2"/>
@@ -307,7 +322,7 @@
         <w:t xml:space="preserve">Core Competencies</w:t>
       </w:r>
     </w:p>
-    <w:bookmarkStart w:id="13" w:name="backend-architecture"/>
+    <w:bookmarkStart w:id="14" w:name="backend-architecture"/>
     <w:p>
       <w:pPr>
         <w:pStyle w:val="Heading3"/>
@@ -457,8 +472,8 @@
         <w:t xml:space="preserve">Batch processing and asynchronous workflows</w:t>
       </w:r>
     </w:p>
-    <w:bookmarkEnd w:id="13"/>
-    <w:bookmarkStart w:id="14" w:name="cloud-devops"/>
+    <w:bookmarkEnd w:id="14"/>
+    <w:bookmarkStart w:id="15" w:name="cloud-devops"/>
     <w:p>
       <w:pPr>
         <w:pStyle w:val="Heading3"/>
@@ -575,8 +590,8 @@
         <w:t xml:space="preserve">LocalStack, TestContainers</w:t>
       </w:r>
     </w:p>
-    <w:bookmarkEnd w:id="14"/>
-    <w:bookmarkStart w:id="15" w:name="databases-data"/>
+    <w:bookmarkEnd w:id="15"/>
+    <w:bookmarkStart w:id="16" w:name="databases-data"/>
     <w:p>
       <w:pPr>
         <w:pStyle w:val="Heading3"/>
@@ -645,8 +660,8 @@
         <w:t xml:space="preserve">Data ingestion pipelines</w:t>
       </w:r>
     </w:p>
-    <w:bookmarkEnd w:id="15"/>
-    <w:bookmarkStart w:id="16" w:name="frontend-other-languages"/>
+    <w:bookmarkEnd w:id="16"/>
+    <w:bookmarkStart w:id="17" w:name="frontend-other-languages"/>
     <w:p>
       <w:pPr>
         <w:pStyle w:val="Heading3"/>
@@ -715,8 +730,8 @@
         <w:t xml:space="preserve">C#</w:t>
       </w:r>
     </w:p>
-    <w:bookmarkEnd w:id="16"/>
-    <w:bookmarkStart w:id="17" w:name="testing-quality"/>
+    <w:bookmarkEnd w:id="17"/>
+    <w:bookmarkStart w:id="18" w:name="testing-quality"/>
     <w:p>
       <w:pPr>
         <w:pStyle w:val="Heading3"/>
@@ -785,9 +800,9 @@
         <w:t xml:space="preserve">CI quality gates</w:t>
       </w:r>
     </w:p>
-    <w:bookmarkEnd w:id="17"/>
     <w:bookmarkEnd w:id="18"/>
-    <w:bookmarkStart w:id="20" w:name="personal-projects-selected"/>
+    <w:bookmarkEnd w:id="19"/>
+    <w:bookmarkStart w:id="21" w:name="personal-projects-selected"/>
     <w:p>
       <w:pPr>
         <w:pStyle w:val="Heading2"/>
@@ -796,7 +811,7 @@
         <w:t xml:space="preserve">Personal Projects (Selected)</w:t>
       </w:r>
     </w:p>
-    <w:bookmarkStart w:id="19" w:name="v30---self-hosted-saas-product-suite"/>
+    <w:bookmarkStart w:id="20" w:name="v30---self-hosted-saas-product-suite"/>
     <w:p>
       <w:pPr>
         <w:pStyle w:val="Heading3"/>
@@ -1067,9 +1082,9 @@
         <w:t xml:space="preserve">This project demonstrates product ownership, architecture design, and end-to-end system development across seven independent products and five languages/runtimes, beyond enterprise environments.</w:t>
       </w:r>
     </w:p>
-    <w:bookmarkEnd w:id="19"/>
     <w:bookmarkEnd w:id="20"/>
-    <w:bookmarkStart w:id="27" w:name="professional-experience"/>
+    <w:bookmarkEnd w:id="21"/>
+    <w:bookmarkStart w:id="28" w:name="professional-experience"/>
     <w:p>
       <w:pPr>
         <w:pStyle w:val="Heading2"/>
@@ -1078,7 +1093,7 @@
         <w:t xml:space="preserve">Professional Experience</w:t>
       </w:r>
     </w:p>
-    <w:bookmarkStart w:id="21" w:name="orla.tech---anbima"/>
+    <w:bookmarkStart w:id="22" w:name="orla.tech---anbima"/>
     <w:p>
       <w:pPr>
         <w:pStyle w:val="Heading3"/>
@@ -1165,8 +1180,8 @@
         <w:t xml:space="preserve">Simplified complex technical decisions and enabled faster delivery across the squad</w:t>
       </w:r>
     </w:p>
-    <w:bookmarkEnd w:id="21"/>
-    <w:bookmarkStart w:id="22" w:name="X6d4315bd179d35add7287fae26bcb28bb821011"/>
+    <w:bookmarkEnd w:id="22"/>
+    <w:bookmarkStart w:id="23" w:name="X6d4315bd179d35add7287fae26bcb28bb821011"/>
     <w:p>
       <w:pPr>
         <w:pStyle w:val="Heading3"/>
@@ -1241,8 +1256,8 @@
         <w:t xml:space="preserve">Collaborated directly with stakeholders to translate legal requirements into software systems</w:t>
       </w:r>
     </w:p>
-    <w:bookmarkEnd w:id="22"/>
-    <w:bookmarkStart w:id="23" w:name="nttdata---itau-bank"/>
+    <w:bookmarkEnd w:id="23"/>
+    <w:bookmarkStart w:id="24" w:name="nttdata---itau-bank"/>
     <w:p>
       <w:pPr>
         <w:pStyle w:val="Heading3"/>
@@ -1329,8 +1344,8 @@
         <w:t xml:space="preserve">Worked with distributed systems and asynchronous processing</w:t>
       </w:r>
     </w:p>
-    <w:bookmarkEnd w:id="23"/>
-    <w:bookmarkStart w:id="24" w:name="betha-sistemas"/>
+    <w:bookmarkEnd w:id="24"/>
+    <w:bookmarkStart w:id="25" w:name="betha-sistemas"/>
     <w:p>
       <w:pPr>
         <w:pStyle w:val="Heading3"/>
@@ -1405,8 +1420,8 @@
         <w:t xml:space="preserve">Participated in production incident analysis and stability improvements</w:t>
       </w:r>
     </w:p>
-    <w:bookmarkEnd w:id="24"/>
-    <w:bookmarkStart w:id="25" w:name="sistema-info"/>
+    <w:bookmarkEnd w:id="25"/>
+    <w:bookmarkStart w:id="26" w:name="sistema-info"/>
     <w:p>
       <w:pPr>
         <w:pStyle w:val="Heading3"/>
@@ -1457,8 +1472,8 @@
         <w:t xml:space="preserve">Introduced unit testing practices into the team</w:t>
       </w:r>
     </w:p>
-    <w:bookmarkEnd w:id="25"/>
-    <w:bookmarkStart w:id="26" w:name="damyller"/>
+    <w:bookmarkEnd w:id="26"/>
+    <w:bookmarkStart w:id="27" w:name="damyller"/>
     <w:p>
       <w:pPr>
         <w:pStyle w:val="Heading3"/>
@@ -1545,9 +1560,9 @@
         <w:t xml:space="preserve">Provided user support via phone, chat, and an internal help desk tool</w:t>
       </w:r>
     </w:p>
-    <w:bookmarkEnd w:id="26"/>
     <w:bookmarkEnd w:id="27"/>
-    <w:bookmarkStart w:id="29" w:name="education"/>
+    <w:bookmarkEnd w:id="28"/>
+    <w:bookmarkStart w:id="30" w:name="education"/>
     <w:p>
       <w:pPr>
         <w:pStyle w:val="Heading2"/>
@@ -1556,7 +1571,7 @@
         <w:t xml:space="preserve">Education</w:t>
       </w:r>
     </w:p>
-    <w:bookmarkStart w:id="28" w:name="bachelors-degree-in-information-systems"/>
+    <w:bookmarkStart w:id="29" w:name="bachelors-degree-in-information-systems"/>
     <w:p>
       <w:pPr>
         <w:pStyle w:val="Heading3"/>
@@ -1573,9 +1588,9 @@
         <w:t xml:space="preserve">ESUCRI - 2015-2019</w:t>
       </w:r>
     </w:p>
-    <w:bookmarkEnd w:id="28"/>
     <w:bookmarkEnd w:id="29"/>
-    <w:bookmarkStart w:id="30" w:name="certifications"/>
+    <w:bookmarkEnd w:id="30"/>
+    <w:bookmarkStart w:id="31" w:name="certifications"/>
     <w:p>
       <w:pPr>
         <w:pStyle w:val="Heading2"/>
@@ -1596,8 +1611,8 @@
         <w:t xml:space="preserve">AWS Certified Cloud Practitioner (2022)</w:t>
       </w:r>
     </w:p>
-    <w:bookmarkEnd w:id="30"/>
-    <w:bookmarkStart w:id="31" w:name="languages"/>
+    <w:bookmarkEnd w:id="31"/>
+    <w:bookmarkStart w:id="32" w:name="languages"/>
     <w:p>
       <w:pPr>
         <w:pStyle w:val="Heading2"/>
@@ -1630,8 +1645,8 @@
         <w:t xml:space="preserve">English: Fluent</w:t>
       </w:r>
     </w:p>
-    <w:bookmarkEnd w:id="31"/>
     <w:bookmarkEnd w:id="32"/>
+    <w:bookmarkEnd w:id="33"/>
     <w:sectPr>
       <w:footnotePr>
         <w:numRestart w:val="eachSect"/>

</xml_diff>